<commit_message>
feat: expand intelligence workspace and enable LAN access
</commit_message>
<xml_diff>
--- a/mineral-control-atlas/reports/AI深度研究_全球关键矿产反管制体系与供应链重构_专业审阅稿.docx
+++ b/mineral-control-atlas/reports/AI深度研究_全球关键矿产反管制体系与供应链重构_专业审阅稿.docx
@@ -2,10 +2,7 @@
 <file path=word/document.xml><?xml version="1.0" encoding="utf-8"?>
 <w:document xmlns:wpc="http://schemas.microsoft.com/office/word/2010/wordprocessingCanvas" xmlns:mc="http://schemas.openxmlformats.org/markup-compatibility/2006" xmlns:o="urn:schemas-microsoft-com:office:office" xmlns:r="http://schemas.openxmlformats.org/officeDocument/2006/relationships" xmlns:m="http://schemas.openxmlformats.org/officeDocument/2006/math" xmlns:v="urn:schemas-microsoft-com:vml" xmlns:wp14="http://schemas.microsoft.com/office/word/2010/wordprocessingDrawing" xmlns:wp="http://schemas.openxmlformats.org/drawingml/2006/wordprocessingDrawing" xmlns:w="http://schemas.openxmlformats.org/wordprocessingml/2006/main" xmlns:w14="http://schemas.microsoft.com/office/word/2010/wordml" xmlns:w10="urn:schemas-microsoft-com:office:word" xmlns:w15="http://schemas.microsoft.com/office/word/2012/wordml" xmlns:wpg="http://schemas.microsoft.com/office/word/2010/wordprocessingGroup" xmlns:wpi="http://schemas.microsoft.com/office/word/2010/wordprocessingInk" xmlns:wne="http://schemas.microsoft.com/office/word/2006/wordml" xmlns:wps="http://schemas.microsoft.com/office/word/2010/wordprocessingShape" xmlns:wpsCustomData="http://www.wps.cn/officeDocument/2013/wpsCustomData" mc:Ignorable="w14 w15 wp14">
   <w:body>
-    <w:p>
-      <w:bookmarkStart w:id="0" w:name="_GoBack"/>
-      <w:bookmarkEnd w:id="0"/>
-    </w:p>
+    <w:p/>
     <w:p/>
     <w:p/>
     <w:p/>
@@ -8270,34 +8267,30 @@
     </w:p>
     <w:p>
       <w:pPr>
-        <w:spacing w:after="100" w:line="348" w:lineRule="auto"/>
-        <w:jc w:val="both"/>
-      </w:pPr>
-      <w:r>
-        <w:rPr>
-          <w:rFonts w:ascii="Arial" w:hAnsi="Arial" w:eastAsia="宋体"/>
-          <w:b w:val="0"/>
-          <w:i w:val="0"/>
-          <w:color w:val="1F2937"/>
-          <w:sz w:val="21"/>
-        </w:rPr>
-        <w:t>情景分析的目的不是给出看似精确的概率，而是检验不同外部条件下的准备方案。以下四种情景可以并存于不同矿种：同一时期稀土可能进入价格支持市场，锂则仍处低价竞争，镓锗可能因副产扩产缓慢而维持高集中。</w:t>
-      </w:r>
-    </w:p>
-    <w:p>
-      <w:pPr>
         <w:pStyle w:val="164"/>
         <w:jc w:val="left"/>
       </w:pPr>
-      <w:r>
-        <w:t>表13-1  2026—2030关键矿产四种情景</w:t>
+      <w:bookmarkStart w:id="0" w:name="_GoBack"/>
+      <w:bookmarkEnd w:id="0"/>
+      <w:r>
+        <w:t>表13-1  2026—2030关键矿产</w:t>
+      </w:r>
+      <w:r>
+        <w:rPr>
+          <w:rFonts w:hint="eastAsia"/>
+          <w:lang w:val="en-US" w:eastAsia="zh-CN"/>
+        </w:rPr>
+        <w:t>五</w:t>
+      </w:r>
+      <w:r>
+        <w:t>种情景</w:t>
       </w:r>
     </w:p>
     <w:tbl>
       <w:tblPr>
-        <w:tblStyle w:val="33"/>
-        <w:tblW w:w="9360" w:type="dxa"/>
-        <w:tblInd w:w="120" w:type="dxa"/>
+        <w:tblStyle w:val="32"/>
+        <w:tblW w:w="9026" w:type="dxa"/>
+        <w:tblInd w:w="0" w:type="dxa"/>
         <w:tblBorders>
           <w:top w:val="single" w:color="auto" w:sz="4" w:space="0"/>
           <w:left w:val="single" w:color="auto" w:sz="4" w:space="0"/>
@@ -8306,19 +8299,19 @@
           <w:insideH w:val="single" w:color="auto" w:sz="4" w:space="0"/>
           <w:insideV w:val="single" w:color="auto" w:sz="4" w:space="0"/>
         </w:tblBorders>
-        <w:tblLayout w:type="fixed"/>
+        <w:tblLayout w:type="autofit"/>
         <w:tblCellMar>
           <w:top w:w="0" w:type="dxa"/>
-          <w:left w:w="108" w:type="dxa"/>
+          <w:left w:w="10" w:type="dxa"/>
           <w:bottom w:w="0" w:type="dxa"/>
-          <w:right w:w="108" w:type="dxa"/>
+          <w:right w:w="10" w:type="dxa"/>
         </w:tblCellMar>
       </w:tblPr>
       <w:tblGrid>
-        <w:gridCol w:w="1650"/>
-        <w:gridCol w:w="2850"/>
-        <w:gridCol w:w="2920"/>
-        <w:gridCol w:w="1940"/>
+        <w:gridCol w:w="2256"/>
+        <w:gridCol w:w="2256"/>
+        <w:gridCol w:w="2256"/>
+        <w:gridCol w:w="2258"/>
       </w:tblGrid>
       <w:tr>
         <w:tblPrEx>
@@ -8332,127 +8325,172 @@
           </w:tblBorders>
           <w:tblCellMar>
             <w:top w:w="0" w:type="dxa"/>
-            <w:left w:w="108" w:type="dxa"/>
+            <w:left w:w="10" w:type="dxa"/>
             <w:bottom w:w="0" w:type="dxa"/>
-            <w:right w:w="108" w:type="dxa"/>
+            <w:right w:w="10" w:type="dxa"/>
           </w:tblCellMar>
         </w:tblPrEx>
-        <w:trPr>
-          <w:tblHeader/>
-        </w:trPr>
-        <w:tc>
-          <w:tcPr>
-            <w:tcW w:w="1650" w:type="dxa"/>
-            <w:shd w:val="clear" w:color="auto" w:fill="17365D"/>
+        <w:tc>
+          <w:tcPr>
+            <w:tcW w:w="2256" w:type="dxa"/>
+            <w:tcBorders>
+              <w:top w:val="single" w:color="999999" w:sz="4" w:space="0"/>
+              <w:left w:val="single" w:color="999999" w:sz="4" w:space="0"/>
+              <w:bottom w:val="single" w:color="999999" w:sz="4" w:space="0"/>
+              <w:right w:val="single" w:color="999999" w:sz="4" w:space="0"/>
+            </w:tcBorders>
             <w:tcMar>
-              <w:top w:w="90" w:type="dxa"/>
-              <w:left w:w="120" w:type="dxa"/>
-              <w:bottom w:w="90" w:type="dxa"/>
-              <w:right w:w="120" w:type="dxa"/>
+              <w:top w:w="60" w:type="dxa"/>
+              <w:left w:w="100" w:type="dxa"/>
+              <w:bottom w:w="60" w:type="dxa"/>
+              <w:right w:w="100" w:type="dxa"/>
             </w:tcMar>
             <w:vAlign w:val="center"/>
           </w:tcPr>
           <w:p>
             <w:pPr>
-              <w:spacing w:after="0"/>
-              <w:jc w:val="center"/>
-            </w:pPr>
-            <w:r>
-              <w:rPr>
-                <w:rFonts w:ascii="Arial" w:hAnsi="Arial" w:eastAsia="微软雅黑"/>
+              <w:widowControl w:val="0"/>
+              <w:spacing w:before="0" w:after="0" w:line="240" w:lineRule="auto"/>
+              <w:rPr>
+                <w:rFonts w:cs="宋体"/>
+                <w:szCs w:val="21"/>
+              </w:rPr>
+            </w:pPr>
+            <w:r>
+              <w:rPr>
+                <w:rFonts w:ascii="黑体" w:hAnsi="黑体" w:eastAsia="黑体" w:cs="黑体"/>
                 <w:b/>
-                <w:i w:val="0"/>
-                <w:color w:val="FFFFFF"/>
-                <w:sz w:val="18"/>
-              </w:rPr>
-              <w:t>情景</w:t>
-            </w:r>
-          </w:p>
-        </w:tc>
-        <w:tc>
-          <w:tcPr>
-            <w:tcW w:w="2850" w:type="dxa"/>
-            <w:shd w:val="clear" w:color="auto" w:fill="17365D"/>
+                <w:bCs/>
+                <w:i w:val="0"/>
+                <w:iCs w:val="0"/>
+                <w:color w:val="000000"/>
+                <w:sz w:val="21"/>
+                <w:szCs w:val="21"/>
+              </w:rPr>
+              <w:t>S0</w:t>
+            </w:r>
+          </w:p>
+        </w:tc>
+        <w:tc>
+          <w:tcPr>
+            <w:tcW w:w="2256" w:type="dxa"/>
+            <w:tcBorders>
+              <w:top w:val="single" w:color="999999" w:sz="4" w:space="0"/>
+              <w:left w:val="single" w:color="999999" w:sz="4" w:space="0"/>
+              <w:bottom w:val="single" w:color="999999" w:sz="4" w:space="0"/>
+              <w:right w:val="single" w:color="999999" w:sz="4" w:space="0"/>
+            </w:tcBorders>
             <w:tcMar>
-              <w:top w:w="90" w:type="dxa"/>
-              <w:left w:w="120" w:type="dxa"/>
-              <w:bottom w:w="90" w:type="dxa"/>
-              <w:right w:w="120" w:type="dxa"/>
+              <w:top w:w="60" w:type="dxa"/>
+              <w:left w:w="100" w:type="dxa"/>
+              <w:bottom w:w="60" w:type="dxa"/>
+              <w:right w:w="100" w:type="dxa"/>
             </w:tcMar>
             <w:vAlign w:val="center"/>
           </w:tcPr>
           <w:p>
             <w:pPr>
-              <w:spacing w:after="0"/>
-              <w:jc w:val="center"/>
-            </w:pPr>
-            <w:r>
-              <w:rPr>
-                <w:rFonts w:ascii="Arial" w:hAnsi="Arial" w:eastAsia="微软雅黑"/>
-                <w:b/>
-                <w:i w:val="0"/>
-                <w:color w:val="FFFFFF"/>
-                <w:sz w:val="18"/>
-              </w:rPr>
-              <w:t>触发条件</w:t>
-            </w:r>
-          </w:p>
-        </w:tc>
-        <w:tc>
-          <w:tcPr>
-            <w:tcW w:w="2920" w:type="dxa"/>
-            <w:shd w:val="clear" w:color="auto" w:fill="17365D"/>
+              <w:widowControl w:val="0"/>
+              <w:spacing w:before="0" w:after="0" w:line="240" w:lineRule="auto"/>
+              <w:rPr>
+                <w:rFonts w:cs="宋体"/>
+                <w:szCs w:val="21"/>
+              </w:rPr>
+            </w:pPr>
+            <w:r>
+              <w:rPr>
+                <w:rFonts w:ascii="宋体" w:hAnsi="宋体" w:eastAsia="宋体" w:cs="宋体"/>
+                <w:b w:val="0"/>
+                <w:bCs w:val="0"/>
+                <w:i w:val="0"/>
+                <w:iCs w:val="0"/>
+                <w:color w:val="000000"/>
+                <w:sz w:val="21"/>
+                <w:szCs w:val="21"/>
+              </w:rPr>
+              <w:t>制度性博弈常态（基准）</w:t>
+            </w:r>
+          </w:p>
+        </w:tc>
+        <w:tc>
+          <w:tcPr>
+            <w:tcW w:w="2256" w:type="dxa"/>
+            <w:tcBorders>
+              <w:top w:val="single" w:color="999999" w:sz="4" w:space="0"/>
+              <w:left w:val="single" w:color="999999" w:sz="4" w:space="0"/>
+              <w:bottom w:val="single" w:color="999999" w:sz="4" w:space="0"/>
+              <w:right w:val="single" w:color="999999" w:sz="4" w:space="0"/>
+            </w:tcBorders>
             <w:tcMar>
-              <w:top w:w="90" w:type="dxa"/>
-              <w:left w:w="120" w:type="dxa"/>
-              <w:bottom w:w="90" w:type="dxa"/>
-              <w:right w:w="120" w:type="dxa"/>
+              <w:top w:w="60" w:type="dxa"/>
+              <w:left w:w="100" w:type="dxa"/>
+              <w:bottom w:w="60" w:type="dxa"/>
+              <w:right w:w="100" w:type="dxa"/>
             </w:tcMar>
             <w:vAlign w:val="center"/>
           </w:tcPr>
           <w:p>
             <w:pPr>
-              <w:spacing w:after="0"/>
-              <w:jc w:val="center"/>
-            </w:pPr>
-            <w:r>
-              <w:rPr>
-                <w:rFonts w:ascii="Arial" w:hAnsi="Arial" w:eastAsia="微软雅黑"/>
+              <w:widowControl w:val="0"/>
+              <w:spacing w:before="0" w:after="0" w:line="240" w:lineRule="auto"/>
+              <w:rPr>
+                <w:rFonts w:cs="宋体"/>
+                <w:szCs w:val="21"/>
+              </w:rPr>
+            </w:pPr>
+            <w:r>
+              <w:rPr>
+                <w:rFonts w:ascii="黑体" w:hAnsi="黑体" w:eastAsia="黑体" w:cs="黑体"/>
                 <w:b/>
-                <w:i w:val="0"/>
-                <w:color w:val="FFFFFF"/>
-                <w:sz w:val="18"/>
-              </w:rPr>
-              <w:t>主要结果</w:t>
-            </w:r>
-          </w:p>
-        </w:tc>
-        <w:tc>
-          <w:tcPr>
-            <w:tcW w:w="1940" w:type="dxa"/>
-            <w:shd w:val="clear" w:color="auto" w:fill="17365D"/>
+                <w:bCs/>
+                <w:i w:val="0"/>
+                <w:iCs w:val="0"/>
+                <w:color w:val="000000"/>
+                <w:sz w:val="21"/>
+                <w:szCs w:val="21"/>
+              </w:rPr>
+              <w:t>45%</w:t>
+            </w:r>
+          </w:p>
+        </w:tc>
+        <w:tc>
+          <w:tcPr>
+            <w:tcW w:w="2258" w:type="dxa"/>
+            <w:tcBorders>
+              <w:top w:val="single" w:color="999999" w:sz="4" w:space="0"/>
+              <w:left w:val="single" w:color="999999" w:sz="4" w:space="0"/>
+              <w:bottom w:val="single" w:color="999999" w:sz="4" w:space="0"/>
+              <w:right w:val="single" w:color="999999" w:sz="4" w:space="0"/>
+            </w:tcBorders>
             <w:tcMar>
-              <w:top w:w="90" w:type="dxa"/>
-              <w:left w:w="120" w:type="dxa"/>
-              <w:bottom w:w="90" w:type="dxa"/>
-              <w:right w:w="120" w:type="dxa"/>
+              <w:top w:w="60" w:type="dxa"/>
+              <w:left w:w="100" w:type="dxa"/>
+              <w:bottom w:w="60" w:type="dxa"/>
+              <w:right w:w="100" w:type="dxa"/>
             </w:tcMar>
             <w:vAlign w:val="center"/>
           </w:tcPr>
           <w:p>
             <w:pPr>
-              <w:spacing w:after="0"/>
-              <w:jc w:val="center"/>
-            </w:pPr>
-            <w:r>
-              <w:rPr>
-                <w:rFonts w:ascii="Arial" w:hAnsi="Arial" w:eastAsia="微软雅黑"/>
-                <w:b/>
-                <w:i w:val="0"/>
-                <w:color w:val="FFFFFF"/>
-                <w:sz w:val="18"/>
-              </w:rPr>
-              <w:t>领先指标</w:t>
+              <w:widowControl w:val="0"/>
+              <w:spacing w:before="0" w:after="0" w:line="240" w:lineRule="auto"/>
+              <w:rPr>
+                <w:rFonts w:cs="宋体"/>
+                <w:szCs w:val="21"/>
+              </w:rPr>
+            </w:pPr>
+            <w:r>
+              <w:rPr>
+                <w:rFonts w:ascii="宋体" w:hAnsi="宋体" w:eastAsia="宋体" w:cs="宋体"/>
+                <w:b w:val="0"/>
+                <w:bCs w:val="0"/>
+                <w:i w:val="0"/>
+                <w:iCs w:val="0"/>
+                <w:color w:val="000000"/>
+                <w:sz w:val="21"/>
+                <w:szCs w:val="21"/>
+              </w:rPr>
+              <w:t>管制清单年度微调、盟友替代链部分成型、摩擦常态化但无全面脱钩</w:t>
             </w:r>
           </w:p>
         </w:tc>
@@ -8469,92 +8507,172 @@
           </w:tblBorders>
           <w:tblCellMar>
             <w:top w:w="0" w:type="dxa"/>
-            <w:left w:w="108" w:type="dxa"/>
+            <w:left w:w="10" w:type="dxa"/>
             <w:bottom w:w="0" w:type="dxa"/>
-            <w:right w:w="108" w:type="dxa"/>
+            <w:right w:w="10" w:type="dxa"/>
           </w:tblCellMar>
         </w:tblPrEx>
         <w:tc>
           <w:tcPr>
-            <w:tcW w:w="1650" w:type="dxa"/>
-          </w:tcPr>
-          <w:p>
-            <w:pPr>
-              <w:spacing w:after="0" w:line="276" w:lineRule="auto"/>
-              <w:jc w:val="center"/>
-            </w:pPr>
-            <w:r>
-              <w:rPr>
-                <w:rFonts w:ascii="Arial" w:hAnsi="Arial" w:eastAsia="宋体"/>
+            <w:tcW w:w="2256" w:type="dxa"/>
+            <w:tcBorders>
+              <w:top w:val="single" w:color="999999" w:sz="4" w:space="0"/>
+              <w:left w:val="single" w:color="999999" w:sz="4" w:space="0"/>
+              <w:bottom w:val="single" w:color="999999" w:sz="4" w:space="0"/>
+              <w:right w:val="single" w:color="999999" w:sz="4" w:space="0"/>
+            </w:tcBorders>
+            <w:tcMar>
+              <w:top w:w="60" w:type="dxa"/>
+              <w:left w:w="100" w:type="dxa"/>
+              <w:bottom w:w="60" w:type="dxa"/>
+              <w:right w:w="100" w:type="dxa"/>
+            </w:tcMar>
+            <w:vAlign w:val="center"/>
+          </w:tcPr>
+          <w:p>
+            <w:pPr>
+              <w:widowControl w:val="0"/>
+              <w:spacing w:before="0" w:after="0" w:line="240" w:lineRule="auto"/>
+              <w:rPr>
+                <w:rFonts w:cs="宋体"/>
+                <w:szCs w:val="21"/>
+              </w:rPr>
+            </w:pPr>
+            <w:r>
+              <w:rPr>
+                <w:rFonts w:ascii="黑体" w:hAnsi="黑体" w:eastAsia="黑体" w:cs="黑体"/>
+                <w:b/>
+                <w:bCs/>
+                <w:i w:val="0"/>
+                <w:iCs w:val="0"/>
+                <w:color w:val="000000"/>
+                <w:sz w:val="21"/>
+                <w:szCs w:val="21"/>
+              </w:rPr>
+              <w:t>S1</w:t>
+            </w:r>
+          </w:p>
+        </w:tc>
+        <w:tc>
+          <w:tcPr>
+            <w:tcW w:w="2256" w:type="dxa"/>
+            <w:tcBorders>
+              <w:top w:val="single" w:color="999999" w:sz="4" w:space="0"/>
+              <w:left w:val="single" w:color="999999" w:sz="4" w:space="0"/>
+              <w:bottom w:val="single" w:color="999999" w:sz="4" w:space="0"/>
+              <w:right w:val="single" w:color="999999" w:sz="4" w:space="0"/>
+            </w:tcBorders>
+            <w:tcMar>
+              <w:top w:w="60" w:type="dxa"/>
+              <w:left w:w="100" w:type="dxa"/>
+              <w:bottom w:w="60" w:type="dxa"/>
+              <w:right w:w="100" w:type="dxa"/>
+            </w:tcMar>
+            <w:vAlign w:val="center"/>
+          </w:tcPr>
+          <w:p>
+            <w:pPr>
+              <w:widowControl w:val="0"/>
+              <w:spacing w:before="0" w:after="0" w:line="240" w:lineRule="auto"/>
+              <w:rPr>
+                <w:rFonts w:cs="宋体"/>
+                <w:szCs w:val="21"/>
+              </w:rPr>
+            </w:pPr>
+            <w:r>
+              <w:rPr>
+                <w:rFonts w:ascii="宋体" w:hAnsi="宋体" w:eastAsia="宋体" w:cs="宋体"/>
                 <w:b w:val="0"/>
-                <w:i w:val="0"/>
-                <w:color w:val="1F2937"/>
-                <w:sz w:val="17"/>
-              </w:rPr>
-              <w:t>A 管理型许可与渐进多元化</w:t>
-            </w:r>
-          </w:p>
-        </w:tc>
-        <w:tc>
-          <w:tcPr>
-            <w:tcW w:w="2850" w:type="dxa"/>
-          </w:tcPr>
-          <w:p>
-            <w:pPr>
-              <w:spacing w:after="0" w:line="276" w:lineRule="auto"/>
-              <w:jc w:val="left"/>
-            </w:pPr>
-            <w:r>
-              <w:rPr>
-                <w:rFonts w:ascii="Arial" w:hAnsi="Arial" w:eastAsia="宋体"/>
+                <w:bCs w:val="0"/>
+                <w:i w:val="0"/>
+                <w:iCs w:val="0"/>
+                <w:color w:val="000000"/>
+                <w:sz w:val="21"/>
+                <w:szCs w:val="21"/>
+              </w:rPr>
+              <w:t>螺旋升级·定向断供</w:t>
+            </w:r>
+          </w:p>
+        </w:tc>
+        <w:tc>
+          <w:tcPr>
+            <w:tcW w:w="2256" w:type="dxa"/>
+            <w:tcBorders>
+              <w:top w:val="single" w:color="999999" w:sz="4" w:space="0"/>
+              <w:left w:val="single" w:color="999999" w:sz="4" w:space="0"/>
+              <w:bottom w:val="single" w:color="999999" w:sz="4" w:space="0"/>
+              <w:right w:val="single" w:color="999999" w:sz="4" w:space="0"/>
+            </w:tcBorders>
+            <w:tcMar>
+              <w:top w:w="60" w:type="dxa"/>
+              <w:left w:w="100" w:type="dxa"/>
+              <w:bottom w:w="60" w:type="dxa"/>
+              <w:right w:w="100" w:type="dxa"/>
+            </w:tcMar>
+            <w:vAlign w:val="center"/>
+          </w:tcPr>
+          <w:p>
+            <w:pPr>
+              <w:widowControl w:val="0"/>
+              <w:spacing w:before="0" w:after="0" w:line="240" w:lineRule="auto"/>
+              <w:rPr>
+                <w:rFonts w:cs="宋体"/>
+                <w:szCs w:val="21"/>
+              </w:rPr>
+            </w:pPr>
+            <w:r>
+              <w:rPr>
+                <w:rFonts w:ascii="黑体" w:hAnsi="黑体" w:eastAsia="黑体" w:cs="黑体"/>
+                <w:b/>
+                <w:bCs/>
+                <w:i w:val="0"/>
+                <w:iCs w:val="0"/>
+                <w:color w:val="000000"/>
+                <w:sz w:val="21"/>
+                <w:szCs w:val="21"/>
+              </w:rPr>
+              <w:t>25%</w:t>
+            </w:r>
+          </w:p>
+        </w:tc>
+        <w:tc>
+          <w:tcPr>
+            <w:tcW w:w="2258" w:type="dxa"/>
+            <w:tcBorders>
+              <w:top w:val="single" w:color="999999" w:sz="4" w:space="0"/>
+              <w:left w:val="single" w:color="999999" w:sz="4" w:space="0"/>
+              <w:bottom w:val="single" w:color="999999" w:sz="4" w:space="0"/>
+              <w:right w:val="single" w:color="999999" w:sz="4" w:space="0"/>
+            </w:tcBorders>
+            <w:tcMar>
+              <w:top w:w="60" w:type="dxa"/>
+              <w:left w:w="100" w:type="dxa"/>
+              <w:bottom w:w="60" w:type="dxa"/>
+              <w:right w:w="100" w:type="dxa"/>
+            </w:tcMar>
+            <w:vAlign w:val="center"/>
+          </w:tcPr>
+          <w:p>
+            <w:pPr>
+              <w:widowControl w:val="0"/>
+              <w:spacing w:before="0" w:after="0" w:line="240" w:lineRule="auto"/>
+              <w:rPr>
+                <w:rFonts w:cs="宋体"/>
+                <w:szCs w:val="21"/>
+              </w:rPr>
+            </w:pPr>
+            <w:r>
+              <w:rPr>
+                <w:rFonts w:ascii="宋体" w:hAnsi="宋体" w:eastAsia="宋体" w:cs="宋体"/>
                 <w:b w:val="0"/>
-                <w:i w:val="0"/>
-                <w:color w:val="1F2937"/>
-                <w:sz w:val="17"/>
-              </w:rPr>
-              <w:t>许可保持、项目逐步投产、贸易谈判稳定</w:t>
-            </w:r>
-          </w:p>
-        </w:tc>
-        <w:tc>
-          <w:tcPr>
-            <w:tcW w:w="2920" w:type="dxa"/>
-          </w:tcPr>
-          <w:p>
-            <w:pPr>
-              <w:spacing w:after="0" w:line="276" w:lineRule="auto"/>
-              <w:jc w:val="left"/>
-            </w:pPr>
-            <w:r>
-              <w:rPr>
-                <w:rFonts w:ascii="Arial" w:hAnsi="Arial" w:eastAsia="宋体"/>
-                <w:b w:val="0"/>
-                <w:i w:val="0"/>
-                <w:color w:val="1F2937"/>
-                <w:sz w:val="17"/>
-              </w:rPr>
-              <w:t>区域价差下降但不消失；中游集中缓慢下降</w:t>
-            </w:r>
-          </w:p>
-        </w:tc>
-        <w:tc>
-          <w:tcPr>
-            <w:tcW w:w="1940" w:type="dxa"/>
-          </w:tcPr>
-          <w:p>
-            <w:pPr>
-              <w:spacing w:after="0" w:line="276" w:lineRule="auto"/>
-              <w:jc w:val="left"/>
-            </w:pPr>
-            <w:r>
-              <w:rPr>
-                <w:rFonts w:ascii="Arial" w:hAnsi="Arial" w:eastAsia="宋体"/>
-                <w:b w:val="0"/>
-                <w:i w:val="0"/>
-                <w:color w:val="1F2937"/>
-                <w:sz w:val="17"/>
-              </w:rPr>
-              <w:t>审批时长、出口恢复、项目认证</w:t>
+                <w:bCs w:val="0"/>
+                <w:i w:val="0"/>
+                <w:iCs w:val="0"/>
+                <w:color w:val="000000"/>
+                <w:sz w:val="21"/>
+                <w:szCs w:val="21"/>
+              </w:rPr>
+              <w:t>地缘冲突触发"以矿制链"，对特定国家特定物项精准断供+域外管辖执法</w:t>
             </w:r>
           </w:p>
         </w:tc>
@@ -8571,96 +8689,172 @@
           </w:tblBorders>
           <w:tblCellMar>
             <w:top w:w="0" w:type="dxa"/>
-            <w:left w:w="108" w:type="dxa"/>
+            <w:left w:w="10" w:type="dxa"/>
             <w:bottom w:w="0" w:type="dxa"/>
-            <w:right w:w="108" w:type="dxa"/>
+            <w:right w:w="10" w:type="dxa"/>
           </w:tblCellMar>
         </w:tblPrEx>
         <w:tc>
           <w:tcPr>
-            <w:tcW w:w="1650" w:type="dxa"/>
-            <w:shd w:val="clear" w:color="auto" w:fill="F3F5F7"/>
-          </w:tcPr>
-          <w:p>
-            <w:pPr>
-              <w:spacing w:after="0" w:line="276" w:lineRule="auto"/>
-              <w:jc w:val="center"/>
-            </w:pPr>
-            <w:r>
-              <w:rPr>
-                <w:rFonts w:ascii="Arial" w:hAnsi="Arial" w:eastAsia="宋体"/>
+            <w:tcW w:w="2256" w:type="dxa"/>
+            <w:tcBorders>
+              <w:top w:val="single" w:color="999999" w:sz="4" w:space="0"/>
+              <w:left w:val="single" w:color="999999" w:sz="4" w:space="0"/>
+              <w:bottom w:val="single" w:color="999999" w:sz="4" w:space="0"/>
+              <w:right w:val="single" w:color="999999" w:sz="4" w:space="0"/>
+            </w:tcBorders>
+            <w:tcMar>
+              <w:top w:w="60" w:type="dxa"/>
+              <w:left w:w="100" w:type="dxa"/>
+              <w:bottom w:w="60" w:type="dxa"/>
+              <w:right w:w="100" w:type="dxa"/>
+            </w:tcMar>
+            <w:vAlign w:val="center"/>
+          </w:tcPr>
+          <w:p>
+            <w:pPr>
+              <w:widowControl w:val="0"/>
+              <w:spacing w:before="0" w:after="0" w:line="240" w:lineRule="auto"/>
+              <w:rPr>
+                <w:rFonts w:cs="宋体"/>
+                <w:szCs w:val="21"/>
+              </w:rPr>
+            </w:pPr>
+            <w:r>
+              <w:rPr>
+                <w:rFonts w:ascii="黑体" w:hAnsi="黑体" w:eastAsia="黑体" w:cs="黑体"/>
+                <w:b/>
+                <w:bCs/>
+                <w:i w:val="0"/>
+                <w:iCs w:val="0"/>
+                <w:color w:val="000000"/>
+                <w:sz w:val="21"/>
+                <w:szCs w:val="21"/>
+              </w:rPr>
+              <w:t>S2</w:t>
+            </w:r>
+          </w:p>
+        </w:tc>
+        <w:tc>
+          <w:tcPr>
+            <w:tcW w:w="2256" w:type="dxa"/>
+            <w:tcBorders>
+              <w:top w:val="single" w:color="999999" w:sz="4" w:space="0"/>
+              <w:left w:val="single" w:color="999999" w:sz="4" w:space="0"/>
+              <w:bottom w:val="single" w:color="999999" w:sz="4" w:space="0"/>
+              <w:right w:val="single" w:color="999999" w:sz="4" w:space="0"/>
+            </w:tcBorders>
+            <w:tcMar>
+              <w:top w:w="60" w:type="dxa"/>
+              <w:left w:w="100" w:type="dxa"/>
+              <w:bottom w:w="60" w:type="dxa"/>
+              <w:right w:w="100" w:type="dxa"/>
+            </w:tcMar>
+            <w:vAlign w:val="center"/>
+          </w:tcPr>
+          <w:p>
+            <w:pPr>
+              <w:widowControl w:val="0"/>
+              <w:spacing w:before="0" w:after="0" w:line="240" w:lineRule="auto"/>
+              <w:rPr>
+                <w:rFonts w:cs="宋体"/>
+                <w:szCs w:val="21"/>
+              </w:rPr>
+            </w:pPr>
+            <w:r>
+              <w:rPr>
+                <w:rFonts w:ascii="宋体" w:hAnsi="宋体" w:eastAsia="宋体" w:cs="宋体"/>
                 <w:b w:val="0"/>
-                <w:i w:val="0"/>
-                <w:color w:val="1F2937"/>
-                <w:sz w:val="17"/>
-              </w:rPr>
-              <w:t>B 集团化分链</w:t>
-            </w:r>
-          </w:p>
-        </w:tc>
-        <w:tc>
-          <w:tcPr>
-            <w:tcW w:w="2850" w:type="dxa"/>
-            <w:shd w:val="clear" w:color="auto" w:fill="F3F5F7"/>
-          </w:tcPr>
-          <w:p>
-            <w:pPr>
-              <w:spacing w:after="0" w:line="276" w:lineRule="auto"/>
-              <w:jc w:val="left"/>
-            </w:pPr>
-            <w:r>
-              <w:rPr>
-                <w:rFonts w:ascii="Arial" w:hAnsi="Arial" w:eastAsia="宋体"/>
+                <w:bCs w:val="0"/>
+                <w:i w:val="0"/>
+                <w:iCs w:val="0"/>
+                <w:color w:val="000000"/>
+                <w:sz w:val="21"/>
+                <w:szCs w:val="21"/>
+              </w:rPr>
+              <w:t>阵营化·平行体系</w:t>
+            </w:r>
+          </w:p>
+        </w:tc>
+        <w:tc>
+          <w:tcPr>
+            <w:tcW w:w="2256" w:type="dxa"/>
+            <w:tcBorders>
+              <w:top w:val="single" w:color="999999" w:sz="4" w:space="0"/>
+              <w:left w:val="single" w:color="999999" w:sz="4" w:space="0"/>
+              <w:bottom w:val="single" w:color="999999" w:sz="4" w:space="0"/>
+              <w:right w:val="single" w:color="999999" w:sz="4" w:space="0"/>
+            </w:tcBorders>
+            <w:tcMar>
+              <w:top w:w="60" w:type="dxa"/>
+              <w:left w:w="100" w:type="dxa"/>
+              <w:bottom w:w="60" w:type="dxa"/>
+              <w:right w:w="100" w:type="dxa"/>
+            </w:tcMar>
+            <w:vAlign w:val="center"/>
+          </w:tcPr>
+          <w:p>
+            <w:pPr>
+              <w:widowControl w:val="0"/>
+              <w:spacing w:before="0" w:after="0" w:line="240" w:lineRule="auto"/>
+              <w:rPr>
+                <w:rFonts w:cs="宋体"/>
+                <w:szCs w:val="21"/>
+              </w:rPr>
+            </w:pPr>
+            <w:r>
+              <w:rPr>
+                <w:rFonts w:ascii="黑体" w:hAnsi="黑体" w:eastAsia="黑体" w:cs="黑体"/>
+                <w:b/>
+                <w:bCs/>
+                <w:i w:val="0"/>
+                <w:iCs w:val="0"/>
+                <w:color w:val="000000"/>
+                <w:sz w:val="21"/>
+                <w:szCs w:val="21"/>
+              </w:rPr>
+              <w:t>18%</w:t>
+            </w:r>
+          </w:p>
+        </w:tc>
+        <w:tc>
+          <w:tcPr>
+            <w:tcW w:w="2258" w:type="dxa"/>
+            <w:tcBorders>
+              <w:top w:val="single" w:color="999999" w:sz="4" w:space="0"/>
+              <w:left w:val="single" w:color="999999" w:sz="4" w:space="0"/>
+              <w:bottom w:val="single" w:color="999999" w:sz="4" w:space="0"/>
+              <w:right w:val="single" w:color="999999" w:sz="4" w:space="0"/>
+            </w:tcBorders>
+            <w:tcMar>
+              <w:top w:w="60" w:type="dxa"/>
+              <w:left w:w="100" w:type="dxa"/>
+              <w:bottom w:w="60" w:type="dxa"/>
+              <w:right w:w="100" w:type="dxa"/>
+            </w:tcMar>
+            <w:vAlign w:val="center"/>
+          </w:tcPr>
+          <w:p>
+            <w:pPr>
+              <w:widowControl w:val="0"/>
+              <w:spacing w:before="0" w:after="0" w:line="240" w:lineRule="auto"/>
+              <w:rPr>
+                <w:rFonts w:cs="宋体"/>
+                <w:szCs w:val="21"/>
+              </w:rPr>
+            </w:pPr>
+            <w:r>
+              <w:rPr>
+                <w:rFonts w:ascii="宋体" w:hAnsi="宋体" w:eastAsia="宋体" w:cs="宋体"/>
                 <w:b w:val="0"/>
-                <w:i w:val="0"/>
-                <w:color w:val="1F2937"/>
-                <w:sz w:val="17"/>
-              </w:rPr>
-              <w:t>原产地、采购和投资规则进一步集团化</w:t>
-            </w:r>
-          </w:p>
-        </w:tc>
-        <w:tc>
-          <w:tcPr>
-            <w:tcW w:w="2920" w:type="dxa"/>
-            <w:shd w:val="clear" w:color="auto" w:fill="F3F5F7"/>
-          </w:tcPr>
-          <w:p>
-            <w:pPr>
-              <w:spacing w:after="0" w:line="276" w:lineRule="auto"/>
-              <w:jc w:val="left"/>
-            </w:pPr>
-            <w:r>
-              <w:rPr>
-                <w:rFonts w:ascii="Arial" w:hAnsi="Arial" w:eastAsia="宋体"/>
-                <w:b w:val="0"/>
-                <w:i w:val="0"/>
-                <w:color w:val="1F2937"/>
-                <w:sz w:val="17"/>
-              </w:rPr>
-              <w:t>盟友市场与全球现货市场分化，成本上升</w:t>
-            </w:r>
-          </w:p>
-        </w:tc>
-        <w:tc>
-          <w:tcPr>
-            <w:tcW w:w="1940" w:type="dxa"/>
-            <w:shd w:val="clear" w:color="auto" w:fill="F3F5F7"/>
-          </w:tcPr>
-          <w:p>
-            <w:pPr>
-              <w:spacing w:after="0" w:line="276" w:lineRule="auto"/>
-              <w:jc w:val="left"/>
-            </w:pPr>
-            <w:r>
-              <w:rPr>
-                <w:rFonts w:ascii="Arial" w:hAnsi="Arial" w:eastAsia="宋体"/>
-                <w:b w:val="0"/>
-                <w:i w:val="0"/>
-                <w:color w:val="1F2937"/>
-                <w:sz w:val="17"/>
-              </w:rPr>
-              <w:t>承购排他、关税/配额、投资审查</w:t>
+                <w:bCs w:val="0"/>
+                <w:i w:val="0"/>
+                <w:iCs w:val="0"/>
+                <w:color w:val="000000"/>
+                <w:sz w:val="21"/>
+                <w:szCs w:val="21"/>
+              </w:rPr>
+              <w:t>中美各建排他性矿产集团，第三方被迫选边，海关成"经济北约"前线</w:t>
             </w:r>
           </w:p>
         </w:tc>
@@ -8677,92 +8871,172 @@
           </w:tblBorders>
           <w:tblCellMar>
             <w:top w:w="0" w:type="dxa"/>
-            <w:left w:w="108" w:type="dxa"/>
+            <w:left w:w="10" w:type="dxa"/>
             <w:bottom w:w="0" w:type="dxa"/>
-            <w:right w:w="108" w:type="dxa"/>
+            <w:right w:w="10" w:type="dxa"/>
           </w:tblCellMar>
         </w:tblPrEx>
         <w:tc>
           <w:tcPr>
-            <w:tcW w:w="1650" w:type="dxa"/>
-          </w:tcPr>
-          <w:p>
-            <w:pPr>
-              <w:spacing w:after="0" w:line="276" w:lineRule="auto"/>
-              <w:jc w:val="center"/>
-            </w:pPr>
-            <w:r>
-              <w:rPr>
-                <w:rFonts w:ascii="Arial" w:hAnsi="Arial" w:eastAsia="宋体"/>
+            <w:tcW w:w="2256" w:type="dxa"/>
+            <w:tcBorders>
+              <w:top w:val="single" w:color="999999" w:sz="4" w:space="0"/>
+              <w:left w:val="single" w:color="999999" w:sz="4" w:space="0"/>
+              <w:bottom w:val="single" w:color="999999" w:sz="4" w:space="0"/>
+              <w:right w:val="single" w:color="999999" w:sz="4" w:space="0"/>
+            </w:tcBorders>
+            <w:tcMar>
+              <w:top w:w="60" w:type="dxa"/>
+              <w:left w:w="100" w:type="dxa"/>
+              <w:bottom w:w="60" w:type="dxa"/>
+              <w:right w:w="100" w:type="dxa"/>
+            </w:tcMar>
+            <w:vAlign w:val="center"/>
+          </w:tcPr>
+          <w:p>
+            <w:pPr>
+              <w:widowControl w:val="0"/>
+              <w:spacing w:before="0" w:after="0" w:line="240" w:lineRule="auto"/>
+              <w:rPr>
+                <w:rFonts w:cs="宋体"/>
+                <w:szCs w:val="21"/>
+              </w:rPr>
+            </w:pPr>
+            <w:r>
+              <w:rPr>
+                <w:rFonts w:ascii="黑体" w:hAnsi="黑体" w:eastAsia="黑体" w:cs="黑体"/>
+                <w:b/>
+                <w:bCs/>
+                <w:i w:val="0"/>
+                <w:iCs w:val="0"/>
+                <w:color w:val="000000"/>
+                <w:sz w:val="21"/>
+                <w:szCs w:val="21"/>
+              </w:rPr>
+              <w:t>S3</w:t>
+            </w:r>
+          </w:p>
+        </w:tc>
+        <w:tc>
+          <w:tcPr>
+            <w:tcW w:w="2256" w:type="dxa"/>
+            <w:tcBorders>
+              <w:top w:val="single" w:color="999999" w:sz="4" w:space="0"/>
+              <w:left w:val="single" w:color="999999" w:sz="4" w:space="0"/>
+              <w:bottom w:val="single" w:color="999999" w:sz="4" w:space="0"/>
+              <w:right w:val="single" w:color="999999" w:sz="4" w:space="0"/>
+            </w:tcBorders>
+            <w:tcMar>
+              <w:top w:w="60" w:type="dxa"/>
+              <w:left w:w="100" w:type="dxa"/>
+              <w:bottom w:w="60" w:type="dxa"/>
+              <w:right w:w="100" w:type="dxa"/>
+            </w:tcMar>
+            <w:vAlign w:val="center"/>
+          </w:tcPr>
+          <w:p>
+            <w:pPr>
+              <w:widowControl w:val="0"/>
+              <w:spacing w:before="0" w:after="0" w:line="240" w:lineRule="auto"/>
+              <w:rPr>
+                <w:rFonts w:cs="宋体"/>
+                <w:szCs w:val="21"/>
+              </w:rPr>
+            </w:pPr>
+            <w:r>
+              <w:rPr>
+                <w:rFonts w:ascii="宋体" w:hAnsi="宋体" w:eastAsia="宋体" w:cs="宋体"/>
                 <w:b w:val="0"/>
-                <w:i w:val="0"/>
-                <w:color w:val="1F2937"/>
-                <w:sz w:val="17"/>
-              </w:rPr>
-              <w:t>C 价格支持型双层市场</w:t>
-            </w:r>
-          </w:p>
-        </w:tc>
-        <w:tc>
-          <w:tcPr>
-            <w:tcW w:w="2850" w:type="dxa"/>
-          </w:tcPr>
-          <w:p>
-            <w:pPr>
-              <w:spacing w:after="0" w:line="276" w:lineRule="auto"/>
-              <w:jc w:val="left"/>
-            </w:pPr>
-            <w:r>
-              <w:rPr>
-                <w:rFonts w:ascii="Arial" w:hAnsi="Arial" w:eastAsia="宋体"/>
+                <w:bCs w:val="0"/>
+                <w:i w:val="0"/>
+                <w:iCs w:val="0"/>
+                <w:color w:val="000000"/>
+                <w:sz w:val="21"/>
+                <w:szCs w:val="21"/>
+              </w:rPr>
+              <w:t>缓和·规则共治</w:t>
+            </w:r>
+          </w:p>
+        </w:tc>
+        <w:tc>
+          <w:tcPr>
+            <w:tcW w:w="2256" w:type="dxa"/>
+            <w:tcBorders>
+              <w:top w:val="single" w:color="999999" w:sz="4" w:space="0"/>
+              <w:left w:val="single" w:color="999999" w:sz="4" w:space="0"/>
+              <w:bottom w:val="single" w:color="999999" w:sz="4" w:space="0"/>
+              <w:right w:val="single" w:color="999999" w:sz="4" w:space="0"/>
+            </w:tcBorders>
+            <w:tcMar>
+              <w:top w:w="60" w:type="dxa"/>
+              <w:left w:w="100" w:type="dxa"/>
+              <w:bottom w:w="60" w:type="dxa"/>
+              <w:right w:w="100" w:type="dxa"/>
+            </w:tcMar>
+            <w:vAlign w:val="center"/>
+          </w:tcPr>
+          <w:p>
+            <w:pPr>
+              <w:widowControl w:val="0"/>
+              <w:spacing w:before="0" w:after="0" w:line="240" w:lineRule="auto"/>
+              <w:rPr>
+                <w:rFonts w:cs="宋体"/>
+                <w:szCs w:val="21"/>
+              </w:rPr>
+            </w:pPr>
+            <w:r>
+              <w:rPr>
+                <w:rFonts w:ascii="黑体" w:hAnsi="黑体" w:eastAsia="黑体" w:cs="黑体"/>
+                <w:b/>
+                <w:bCs/>
+                <w:i w:val="0"/>
+                <w:iCs w:val="0"/>
+                <w:color w:val="000000"/>
+                <w:sz w:val="21"/>
+                <w:szCs w:val="21"/>
+              </w:rPr>
+              <w:t>8%</w:t>
+            </w:r>
+          </w:p>
+        </w:tc>
+        <w:tc>
+          <w:tcPr>
+            <w:tcW w:w="2258" w:type="dxa"/>
+            <w:tcBorders>
+              <w:top w:val="single" w:color="999999" w:sz="4" w:space="0"/>
+              <w:left w:val="single" w:color="999999" w:sz="4" w:space="0"/>
+              <w:bottom w:val="single" w:color="999999" w:sz="4" w:space="0"/>
+              <w:right w:val="single" w:color="999999" w:sz="4" w:space="0"/>
+            </w:tcBorders>
+            <w:tcMar>
+              <w:top w:w="60" w:type="dxa"/>
+              <w:left w:w="100" w:type="dxa"/>
+              <w:bottom w:w="60" w:type="dxa"/>
+              <w:right w:w="100" w:type="dxa"/>
+            </w:tcMar>
+            <w:vAlign w:val="center"/>
+          </w:tcPr>
+          <w:p>
+            <w:pPr>
+              <w:widowControl w:val="0"/>
+              <w:spacing w:before="0" w:after="0" w:line="240" w:lineRule="auto"/>
+              <w:rPr>
+                <w:rFonts w:cs="宋体"/>
+                <w:szCs w:val="21"/>
+              </w:rPr>
+            </w:pPr>
+            <w:r>
+              <w:rPr>
+                <w:rFonts w:ascii="宋体" w:hAnsi="宋体" w:eastAsia="宋体" w:cs="宋体"/>
                 <w:b w:val="0"/>
-                <w:i w:val="0"/>
-                <w:color w:val="1F2937"/>
-                <w:sz w:val="17"/>
-              </w:rPr>
-              <w:t>更多政府采用价格底线、合同价差和储备</w:t>
-            </w:r>
-          </w:p>
-        </w:tc>
-        <w:tc>
-          <w:tcPr>
-            <w:tcW w:w="2920" w:type="dxa"/>
-          </w:tcPr>
-          <w:p>
-            <w:pPr>
-              <w:spacing w:after="0" w:line="276" w:lineRule="auto"/>
-              <w:jc w:val="left"/>
-            </w:pPr>
-            <w:r>
-              <w:rPr>
-                <w:rFonts w:ascii="Arial" w:hAnsi="Arial" w:eastAsia="宋体"/>
-                <w:b w:val="0"/>
-                <w:i w:val="0"/>
-                <w:color w:val="1F2937"/>
-                <w:sz w:val="17"/>
-              </w:rPr>
-              <w:t>安全供应获得溢价，财政承担周期风险</w:t>
-            </w:r>
-          </w:p>
-        </w:tc>
-        <w:tc>
-          <w:tcPr>
-            <w:tcW w:w="1940" w:type="dxa"/>
-          </w:tcPr>
-          <w:p>
-            <w:pPr>
-              <w:spacing w:after="0" w:line="276" w:lineRule="auto"/>
-              <w:jc w:val="left"/>
-            </w:pPr>
-            <w:r>
-              <w:rPr>
-                <w:rFonts w:ascii="Arial" w:hAnsi="Arial" w:eastAsia="宋体"/>
-                <w:b w:val="0"/>
-                <w:i w:val="0"/>
-                <w:color w:val="1F2937"/>
-                <w:sz w:val="17"/>
-              </w:rPr>
-              <w:t>政府付款、保底产量、长期合同价差</w:t>
+                <w:bCs w:val="0"/>
+                <w:i w:val="0"/>
+                <w:iCs w:val="0"/>
+                <w:color w:val="000000"/>
+                <w:sz w:val="21"/>
+                <w:szCs w:val="21"/>
+              </w:rPr>
+              <w:t>危机倒逼谈判，建立"矿产北约式"对话与配额缓冲机制</w:t>
             </w:r>
           </w:p>
         </w:tc>
@@ -8779,96 +9053,172 @@
           </w:tblBorders>
           <w:tblCellMar>
             <w:top w:w="0" w:type="dxa"/>
-            <w:left w:w="108" w:type="dxa"/>
+            <w:left w:w="10" w:type="dxa"/>
             <w:bottom w:w="0" w:type="dxa"/>
-            <w:right w:w="108" w:type="dxa"/>
+            <w:right w:w="10" w:type="dxa"/>
           </w:tblCellMar>
         </w:tblPrEx>
         <w:tc>
           <w:tcPr>
-            <w:tcW w:w="1650" w:type="dxa"/>
-            <w:shd w:val="clear" w:color="auto" w:fill="F3F5F7"/>
-          </w:tcPr>
-          <w:p>
-            <w:pPr>
-              <w:spacing w:after="0" w:line="276" w:lineRule="auto"/>
-              <w:jc w:val="center"/>
-            </w:pPr>
-            <w:r>
-              <w:rPr>
-                <w:rFonts w:ascii="Arial" w:hAnsi="Arial" w:eastAsia="宋体"/>
+            <w:tcW w:w="2256" w:type="dxa"/>
+            <w:tcBorders>
+              <w:top w:val="single" w:color="999999" w:sz="4" w:space="0"/>
+              <w:left w:val="single" w:color="999999" w:sz="4" w:space="0"/>
+              <w:bottom w:val="single" w:color="999999" w:sz="4" w:space="0"/>
+              <w:right w:val="single" w:color="999999" w:sz="4" w:space="0"/>
+            </w:tcBorders>
+            <w:tcMar>
+              <w:top w:w="60" w:type="dxa"/>
+              <w:left w:w="100" w:type="dxa"/>
+              <w:bottom w:w="60" w:type="dxa"/>
+              <w:right w:w="100" w:type="dxa"/>
+            </w:tcMar>
+            <w:vAlign w:val="center"/>
+          </w:tcPr>
+          <w:p>
+            <w:pPr>
+              <w:widowControl w:val="0"/>
+              <w:spacing w:before="0" w:after="0" w:line="240" w:lineRule="auto"/>
+              <w:rPr>
+                <w:rFonts w:cs="宋体"/>
+                <w:szCs w:val="21"/>
+              </w:rPr>
+            </w:pPr>
+            <w:r>
+              <w:rPr>
+                <w:rFonts w:ascii="黑体" w:hAnsi="黑体" w:eastAsia="黑体" w:cs="黑体"/>
+                <w:b/>
+                <w:bCs/>
+                <w:i w:val="0"/>
+                <w:iCs w:val="0"/>
+                <w:color w:val="000000"/>
+                <w:sz w:val="21"/>
+                <w:szCs w:val="21"/>
+              </w:rPr>
+              <w:t>S4</w:t>
+            </w:r>
+          </w:p>
+        </w:tc>
+        <w:tc>
+          <w:tcPr>
+            <w:tcW w:w="2256" w:type="dxa"/>
+            <w:tcBorders>
+              <w:top w:val="single" w:color="999999" w:sz="4" w:space="0"/>
+              <w:left w:val="single" w:color="999999" w:sz="4" w:space="0"/>
+              <w:bottom w:val="single" w:color="999999" w:sz="4" w:space="0"/>
+              <w:right w:val="single" w:color="999999" w:sz="4" w:space="0"/>
+            </w:tcBorders>
+            <w:tcMar>
+              <w:top w:w="60" w:type="dxa"/>
+              <w:left w:w="100" w:type="dxa"/>
+              <w:bottom w:w="60" w:type="dxa"/>
+              <w:right w:w="100" w:type="dxa"/>
+            </w:tcMar>
+            <w:vAlign w:val="center"/>
+          </w:tcPr>
+          <w:p>
+            <w:pPr>
+              <w:widowControl w:val="0"/>
+              <w:spacing w:before="0" w:after="0" w:line="240" w:lineRule="auto"/>
+              <w:rPr>
+                <w:rFonts w:cs="宋体"/>
+                <w:szCs w:val="21"/>
+              </w:rPr>
+            </w:pPr>
+            <w:r>
+              <w:rPr>
+                <w:rFonts w:ascii="宋体" w:hAnsi="宋体" w:eastAsia="宋体" w:cs="宋体"/>
                 <w:b w:val="0"/>
-                <w:i w:val="0"/>
-                <w:color w:val="1F2937"/>
-                <w:sz w:val="17"/>
-              </w:rPr>
-              <w:t>D 技术与循环突破</w:t>
-            </w:r>
-          </w:p>
-        </w:tc>
-        <w:tc>
-          <w:tcPr>
-            <w:tcW w:w="2850" w:type="dxa"/>
-            <w:shd w:val="clear" w:color="auto" w:fill="F3F5F7"/>
-          </w:tcPr>
-          <w:p>
-            <w:pPr>
-              <w:spacing w:after="0" w:line="276" w:lineRule="auto"/>
-              <w:jc w:val="left"/>
-            </w:pPr>
-            <w:r>
-              <w:rPr>
-                <w:rFonts w:ascii="Arial" w:hAnsi="Arial" w:eastAsia="宋体"/>
+                <w:bCs w:val="0"/>
+                <w:i w:val="0"/>
+                <w:iCs w:val="0"/>
+                <w:color w:val="000000"/>
+                <w:sz w:val="21"/>
+                <w:szCs w:val="21"/>
+              </w:rPr>
+              <w:t>技术替代·需求塌方</w:t>
+            </w:r>
+          </w:p>
+        </w:tc>
+        <w:tc>
+          <w:tcPr>
+            <w:tcW w:w="2256" w:type="dxa"/>
+            <w:tcBorders>
+              <w:top w:val="single" w:color="999999" w:sz="4" w:space="0"/>
+              <w:left w:val="single" w:color="999999" w:sz="4" w:space="0"/>
+              <w:bottom w:val="single" w:color="999999" w:sz="4" w:space="0"/>
+              <w:right w:val="single" w:color="999999" w:sz="4" w:space="0"/>
+            </w:tcBorders>
+            <w:tcMar>
+              <w:top w:w="60" w:type="dxa"/>
+              <w:left w:w="100" w:type="dxa"/>
+              <w:bottom w:w="60" w:type="dxa"/>
+              <w:right w:w="100" w:type="dxa"/>
+            </w:tcMar>
+            <w:vAlign w:val="center"/>
+          </w:tcPr>
+          <w:p>
+            <w:pPr>
+              <w:widowControl w:val="0"/>
+              <w:spacing w:before="0" w:after="0" w:line="240" w:lineRule="auto"/>
+              <w:rPr>
+                <w:rFonts w:cs="宋体"/>
+                <w:szCs w:val="21"/>
+              </w:rPr>
+            </w:pPr>
+            <w:r>
+              <w:rPr>
+                <w:rFonts w:ascii="黑体" w:hAnsi="黑体" w:eastAsia="黑体" w:cs="黑体"/>
+                <w:b/>
+                <w:bCs/>
+                <w:i w:val="0"/>
+                <w:iCs w:val="0"/>
+                <w:color w:val="000000"/>
+                <w:sz w:val="21"/>
+                <w:szCs w:val="21"/>
+              </w:rPr>
+              <w:t>4%</w:t>
+            </w:r>
+          </w:p>
+        </w:tc>
+        <w:tc>
+          <w:tcPr>
+            <w:tcW w:w="2258" w:type="dxa"/>
+            <w:tcBorders>
+              <w:top w:val="single" w:color="999999" w:sz="4" w:space="0"/>
+              <w:left w:val="single" w:color="999999" w:sz="4" w:space="0"/>
+              <w:bottom w:val="single" w:color="999999" w:sz="4" w:space="0"/>
+              <w:right w:val="single" w:color="999999" w:sz="4" w:space="0"/>
+            </w:tcBorders>
+            <w:tcMar>
+              <w:top w:w="60" w:type="dxa"/>
+              <w:left w:w="100" w:type="dxa"/>
+              <w:bottom w:w="60" w:type="dxa"/>
+              <w:right w:w="100" w:type="dxa"/>
+            </w:tcMar>
+            <w:vAlign w:val="center"/>
+          </w:tcPr>
+          <w:p>
+            <w:pPr>
+              <w:widowControl w:val="0"/>
+              <w:spacing w:before="0" w:after="0" w:line="240" w:lineRule="auto"/>
+              <w:rPr>
+                <w:rFonts w:cs="宋体"/>
+                <w:szCs w:val="21"/>
+              </w:rPr>
+            </w:pPr>
+            <w:r>
+              <w:rPr>
+                <w:rFonts w:ascii="宋体" w:hAnsi="宋体" w:eastAsia="宋体" w:cs="宋体"/>
                 <w:b w:val="0"/>
-                <w:i w:val="0"/>
-                <w:color w:val="1F2937"/>
-                <w:sz w:val="17"/>
-              </w:rPr>
-              <w:t>回收、减量或替代材料通过规模化认证</w:t>
-            </w:r>
-          </w:p>
-        </w:tc>
-        <w:tc>
-          <w:tcPr>
-            <w:tcW w:w="2920" w:type="dxa"/>
-            <w:shd w:val="clear" w:color="auto" w:fill="F3F5F7"/>
-          </w:tcPr>
-          <w:p>
-            <w:pPr>
-              <w:spacing w:after="0" w:line="276" w:lineRule="auto"/>
-              <w:jc w:val="left"/>
-            </w:pPr>
-            <w:r>
-              <w:rPr>
-                <w:rFonts w:ascii="Arial" w:hAnsi="Arial" w:eastAsia="宋体"/>
-                <w:b w:val="0"/>
-                <w:i w:val="0"/>
-                <w:color w:val="1F2937"/>
-                <w:sz w:val="17"/>
-              </w:rPr>
-              <w:t>部分重稀土和电池材料需求弹性提高</w:t>
-            </w:r>
-          </w:p>
-        </w:tc>
-        <w:tc>
-          <w:tcPr>
-            <w:tcW w:w="1940" w:type="dxa"/>
-            <w:shd w:val="clear" w:color="auto" w:fill="F3F5F7"/>
-          </w:tcPr>
-          <w:p>
-            <w:pPr>
-              <w:spacing w:after="0" w:line="276" w:lineRule="auto"/>
-              <w:jc w:val="left"/>
-            </w:pPr>
-            <w:r>
-              <w:rPr>
-                <w:rFonts w:ascii="Arial" w:hAnsi="Arial" w:eastAsia="宋体"/>
-                <w:b w:val="0"/>
-                <w:i w:val="0"/>
-                <w:color w:val="1F2937"/>
-                <w:sz w:val="17"/>
-              </w:rPr>
-              <w:t>再生料占比、单位用量、客户认证</w:t>
+                <w:bCs w:val="0"/>
+                <w:i w:val="0"/>
+                <w:iCs w:val="0"/>
+                <w:color w:val="000000"/>
+                <w:sz w:val="21"/>
+                <w:szCs w:val="21"/>
+              </w:rPr>
+              <w:t>回收/合成/减量化突破，管制红利衰减，博弈重心转移</w:t>
             </w:r>
           </w:p>
         </w:tc>
@@ -8876,39 +9226,1378 @@
     </w:tbl>
     <w:p>
       <w:pPr>
-        <w:spacing w:after="20"/>
-      </w:pPr>
-    </w:p>
-    <w:p>
-      <w:pPr>
-        <w:spacing w:after="100" w:line="348" w:lineRule="auto"/>
-        <w:jc w:val="both"/>
-      </w:pPr>
-      <w:r>
-        <w:rPr>
-          <w:rFonts w:ascii="Arial" w:hAnsi="Arial" w:eastAsia="宋体"/>
+        <w:widowControl w:val="0"/>
+        <w:spacing w:before="0" w:after="120" w:line="240" w:lineRule="auto"/>
+        <w:rPr>
+          <w:rFonts w:cs="宋体"/>
+          <w:szCs w:val="21"/>
+        </w:rPr>
+      </w:pPr>
+    </w:p>
+    <w:p>
+      <w:pPr>
+        <w:widowControl w:val="0"/>
+        <w:spacing w:before="0" w:after="120" w:line="240" w:lineRule="auto"/>
+        <w:rPr>
+          <w:rFonts w:cs="宋体"/>
+          <w:szCs w:val="21"/>
+        </w:rPr>
+      </w:pPr>
+      <w:r>
+        <w:rPr>
+          <w:rFonts w:ascii="宋体" w:hAnsi="宋体" w:eastAsia="宋体" w:cs="宋体"/>
           <w:b w:val="0"/>
+          <w:bCs w:val="0"/>
           <w:i w:val="0"/>
-          <w:color w:val="1F2937"/>
+          <w:iCs w:val="0"/>
+          <w:color w:val="000000"/>
           <w:sz w:val="21"/>
-        </w:rPr>
-        <w:t>基准判断是：到2030年前，供应链会比2024年更分散，但并不会形成完全可替代的全球网络。矿山端多元化快于分离和材料端，政策融资增长快于商业成本下降，联盟项目增加快于合格交付能力。</w:t>
-      </w:r>
-    </w:p>
-    <w:p>
-      <w:pPr>
-        <w:spacing w:after="100" w:line="348" w:lineRule="auto"/>
-        <w:jc w:val="both"/>
-      </w:pPr>
-      <w:r>
-        <w:rPr>
-          <w:rFonts w:ascii="Arial" w:hAnsi="Arial" w:eastAsia="宋体"/>
+          <w:szCs w:val="21"/>
+        </w:rPr>
+        <w:t>*概率合计 100%；S0 为默认路径，S1–S4 为偏离。*</w:t>
+      </w:r>
+    </w:p>
+    <w:p>
+      <w:pPr>
+        <w:spacing w:before="280" w:after="140"/>
+        <w:outlineLvl w:val="0"/>
+        <w:rPr>
+          <w:rFonts w:ascii="黑体" w:hAnsi="黑体" w:eastAsia="黑体" w:cs="黑体"/>
+          <w:b/>
+          <w:bCs/>
+          <w:color w:val="1F4E79"/>
+          <w:sz w:val="28"/>
+          <w:szCs w:val="28"/>
+        </w:rPr>
+      </w:pPr>
+      <w:r>
+        <w:rPr>
+          <w:rFonts w:ascii="宋体" w:hAnsi="宋体" w:eastAsia="宋体" w:cs="宋体"/>
           <w:b w:val="0"/>
+          <w:bCs w:val="0"/>
           <w:i w:val="0"/>
-          <w:color w:val="1F2937"/>
+          <w:iCs w:val="0"/>
+          <w:color w:val="000000"/>
           <w:sz w:val="21"/>
-        </w:rPr>
-        <w:t>最大的上行风险是价格保护和长期承购推动一批中游项目跨过融资门槛；最大的下行风险是低价、许可延误和客户认证失败使项目管线大量推迟。监管部门应按季度更新政策状态，按月跟踪项目里程碑，按事件触发更新企业和物流风险。</w:t>
+          <w:szCs w:val="21"/>
+        </w:rPr>
+        <w:t>三、各情景详述</w:t>
+      </w:r>
+    </w:p>
+    <w:p>
+      <w:pPr>
+        <w:spacing w:before="200" w:after="120"/>
+        <w:outlineLvl w:val="1"/>
+        <w:rPr>
+          <w:rFonts w:ascii="黑体" w:hAnsi="黑体" w:eastAsia="黑体" w:cs="黑体"/>
+          <w:b/>
+          <w:bCs/>
+          <w:color w:val="2E5E8C"/>
+          <w:sz w:val="24"/>
+          <w:szCs w:val="24"/>
+        </w:rPr>
+      </w:pPr>
+      <w:r>
+        <w:rPr>
+          <w:rFonts w:ascii="宋体" w:hAnsi="宋体" w:eastAsia="宋体" w:cs="宋体"/>
+          <w:b w:val="0"/>
+          <w:bCs w:val="0"/>
+          <w:i w:val="0"/>
+          <w:iCs w:val="0"/>
+          <w:color w:val="000000"/>
+          <w:sz w:val="21"/>
+          <w:szCs w:val="21"/>
+        </w:rPr>
+        <w:t>S0 基准：制度性博弈常态（概率 45%）</w:t>
+      </w:r>
+    </w:p>
+    <w:p>
+      <w:pPr>
+        <w:numPr>
+          <w:ilvl w:val="0"/>
+          <w:numId w:val="7"/>
+        </w:numPr>
+        <w:spacing w:after="60"/>
+        <w:ind w:left="720" w:hanging="360"/>
+        <w:rPr>
+          <w:rFonts w:ascii="宋体" w:hAnsi="宋体" w:eastAsia="宋体" w:cs="宋体"/>
+          <w:sz w:val="21"/>
+          <w:szCs w:val="21"/>
+        </w:rPr>
+      </w:pPr>
+      <w:r>
+        <w:rPr>
+          <w:rFonts w:ascii="黑体" w:hAnsi="黑体" w:eastAsia="黑体" w:cs="黑体"/>
+          <w:b/>
+          <w:bCs/>
+          <w:i w:val="0"/>
+          <w:iCs w:val="0"/>
+          <w:color w:val="000000"/>
+          <w:sz w:val="21"/>
+          <w:szCs w:val="21"/>
+        </w:rPr>
+        <w:t>形态</w:t>
+      </w:r>
+      <w:r>
+        <w:rPr>
+          <w:rFonts w:ascii="宋体" w:hAnsi="宋体" w:eastAsia="宋体" w:cs="宋体"/>
+          <w:b w:val="0"/>
+          <w:bCs w:val="0"/>
+          <w:i w:val="0"/>
+          <w:iCs w:val="0"/>
+          <w:color w:val="000000"/>
+          <w:sz w:val="21"/>
+          <w:szCs w:val="21"/>
+        </w:rPr>
+        <w:t>：中国建立"年度清单滚动扩围 + 许可证分级 + 追溯稽查"的常态化机制；美日欧形成"本土开采+盟友加工+联合储备"的替代链，但 2030 年前</w:t>
+      </w:r>
+      <w:r>
+        <w:rPr>
+          <w:rFonts w:ascii="黑体" w:hAnsi="黑体" w:eastAsia="黑体" w:cs="黑体"/>
+          <w:b/>
+          <w:bCs/>
+          <w:i w:val="0"/>
+          <w:iCs w:val="0"/>
+          <w:color w:val="000000"/>
+          <w:sz w:val="21"/>
+          <w:szCs w:val="21"/>
+        </w:rPr>
+        <w:t>难以在稀土永磁、钨深加工上完全去中国化</w:t>
+      </w:r>
+      <w:r>
+        <w:rPr>
+          <w:rFonts w:ascii="宋体" w:hAnsi="宋体" w:eastAsia="宋体" w:cs="宋体"/>
+          <w:b w:val="0"/>
+          <w:bCs w:val="0"/>
+          <w:i w:val="0"/>
+          <w:iCs w:val="0"/>
+          <w:color w:val="000000"/>
+          <w:sz w:val="21"/>
+          <w:szCs w:val="21"/>
+        </w:rPr>
+        <w:t>。</w:t>
+      </w:r>
+    </w:p>
+    <w:p>
+      <w:pPr>
+        <w:numPr>
+          <w:ilvl w:val="0"/>
+          <w:numId w:val="7"/>
+        </w:numPr>
+        <w:spacing w:after="60"/>
+        <w:ind w:left="720" w:hanging="360"/>
+        <w:rPr>
+          <w:rFonts w:ascii="宋体" w:hAnsi="宋体" w:eastAsia="宋体" w:cs="宋体"/>
+          <w:sz w:val="21"/>
+          <w:szCs w:val="21"/>
+        </w:rPr>
+      </w:pPr>
+      <w:r>
+        <w:rPr>
+          <w:rFonts w:ascii="黑体" w:hAnsi="黑体" w:eastAsia="黑体" w:cs="黑体"/>
+          <w:b/>
+          <w:bCs/>
+          <w:i w:val="0"/>
+          <w:iCs w:val="0"/>
+          <w:color w:val="000000"/>
+          <w:sz w:val="21"/>
+          <w:szCs w:val="21"/>
+        </w:rPr>
+        <w:t>管制手法</w:t>
+      </w:r>
+      <w:r>
+        <w:rPr>
+          <w:rFonts w:ascii="宋体" w:hAnsi="宋体" w:eastAsia="宋体" w:cs="宋体"/>
+          <w:b w:val="0"/>
+          <w:bCs w:val="0"/>
+          <w:i w:val="0"/>
+          <w:iCs w:val="0"/>
+          <w:color w:val="000000"/>
+          <w:sz w:val="21"/>
+          <w:szCs w:val="21"/>
+        </w:rPr>
+        <w:t>：从"禁运"转向"配额+用途审查+终用户穿透"，即"不是不卖，是看卖给谁、用来干啥"。</w:t>
+      </w:r>
+    </w:p>
+    <w:p>
+      <w:pPr>
+        <w:numPr>
+          <w:ilvl w:val="0"/>
+          <w:numId w:val="7"/>
+        </w:numPr>
+        <w:spacing w:after="60"/>
+        <w:ind w:left="720" w:hanging="360"/>
+        <w:rPr>
+          <w:rFonts w:ascii="宋体" w:hAnsi="宋体" w:eastAsia="宋体" w:cs="宋体"/>
+          <w:sz w:val="21"/>
+          <w:szCs w:val="21"/>
+        </w:rPr>
+      </w:pPr>
+      <w:r>
+        <w:rPr>
+          <w:rFonts w:ascii="黑体" w:hAnsi="黑体" w:eastAsia="黑体" w:cs="黑体"/>
+          <w:b/>
+          <w:bCs/>
+          <w:i w:val="0"/>
+          <w:iCs w:val="0"/>
+          <w:color w:val="000000"/>
+          <w:sz w:val="21"/>
+          <w:szCs w:val="21"/>
+        </w:rPr>
+        <w:t>反制形态</w:t>
+      </w:r>
+      <w:r>
+        <w:rPr>
+          <w:rFonts w:ascii="宋体" w:hAnsi="宋体" w:eastAsia="宋体" w:cs="宋体"/>
+          <w:b w:val="0"/>
+          <w:bCs w:val="0"/>
+          <w:i w:val="0"/>
+          <w:iCs w:val="0"/>
+          <w:color w:val="000000"/>
+          <w:sz w:val="21"/>
+          <w:szCs w:val="21"/>
+        </w:rPr>
+        <w:t>：对等列入不可靠实体、限制特定美企在华采购、对盟友"合规企业"开通绿色通道（分化策略）。</w:t>
+      </w:r>
+    </w:p>
+    <w:p>
+      <w:pPr>
+        <w:numPr>
+          <w:ilvl w:val="0"/>
+          <w:numId w:val="7"/>
+        </w:numPr>
+        <w:spacing w:after="60"/>
+        <w:ind w:left="720" w:hanging="360"/>
+        <w:rPr>
+          <w:rFonts w:ascii="宋体" w:hAnsi="宋体" w:eastAsia="宋体" w:cs="宋体"/>
+          <w:sz w:val="21"/>
+          <w:szCs w:val="21"/>
+        </w:rPr>
+      </w:pPr>
+      <w:r>
+        <w:rPr>
+          <w:rFonts w:ascii="黑体" w:hAnsi="黑体" w:eastAsia="黑体" w:cs="黑体"/>
+          <w:b/>
+          <w:bCs/>
+          <w:i w:val="0"/>
+          <w:iCs w:val="0"/>
+          <w:color w:val="000000"/>
+          <w:sz w:val="21"/>
+          <w:szCs w:val="21"/>
+        </w:rPr>
+        <w:t>海关含义</w:t>
+      </w:r>
+      <w:r>
+        <w:rPr>
+          <w:rFonts w:ascii="宋体" w:hAnsi="宋体" w:eastAsia="宋体" w:cs="宋体"/>
+          <w:b w:val="0"/>
+          <w:bCs w:val="0"/>
+          <w:i w:val="0"/>
+          <w:iCs w:val="0"/>
+          <w:color w:val="000000"/>
+          <w:sz w:val="21"/>
+          <w:szCs w:val="21"/>
+        </w:rPr>
+        <w:t>：监管长期化、精细化；伪报品名/第三国绕道仍是高频风险；需建设"许可证状态+终用户信息+物流链"的穿透式风控。</w:t>
+      </w:r>
+    </w:p>
+    <w:p>
+      <w:pPr>
+        <w:numPr>
+          <w:ilvl w:val="0"/>
+          <w:numId w:val="7"/>
+        </w:numPr>
+        <w:spacing w:after="60"/>
+        <w:ind w:left="720" w:hanging="360"/>
+        <w:rPr>
+          <w:rFonts w:ascii="宋体" w:hAnsi="宋体" w:eastAsia="宋体" w:cs="宋体"/>
+          <w:sz w:val="21"/>
+          <w:szCs w:val="21"/>
+        </w:rPr>
+      </w:pPr>
+      <w:r>
+        <w:rPr>
+          <w:rFonts w:ascii="黑体" w:hAnsi="黑体" w:eastAsia="黑体" w:cs="黑体"/>
+          <w:b/>
+          <w:bCs/>
+          <w:i w:val="0"/>
+          <w:iCs w:val="0"/>
+          <w:color w:val="000000"/>
+          <w:sz w:val="21"/>
+          <w:szCs w:val="21"/>
+        </w:rPr>
+        <w:t>触发条件</w:t>
+      </w:r>
+      <w:r>
+        <w:rPr>
+          <w:rFonts w:ascii="宋体" w:hAnsi="宋体" w:eastAsia="宋体" w:cs="宋体"/>
+          <w:b w:val="0"/>
+          <w:bCs w:val="0"/>
+          <w:i w:val="0"/>
+          <w:iCs w:val="0"/>
+          <w:color w:val="000000"/>
+          <w:sz w:val="21"/>
+          <w:szCs w:val="21"/>
+        </w:rPr>
+        <w:t>：无重大地缘冲突、双方维持"竞合"基调。</w:t>
+      </w:r>
+    </w:p>
+    <w:p>
+      <w:pPr>
+        <w:spacing w:before="200" w:after="120"/>
+        <w:outlineLvl w:val="1"/>
+        <w:rPr>
+          <w:rFonts w:ascii="黑体" w:hAnsi="黑体" w:eastAsia="黑体" w:cs="黑体"/>
+          <w:b/>
+          <w:bCs/>
+          <w:color w:val="2E5E8C"/>
+          <w:sz w:val="24"/>
+          <w:szCs w:val="24"/>
+        </w:rPr>
+      </w:pPr>
+      <w:r>
+        <w:rPr>
+          <w:rFonts w:ascii="宋体" w:hAnsi="宋体" w:eastAsia="宋体" w:cs="宋体"/>
+          <w:b w:val="0"/>
+          <w:bCs w:val="0"/>
+          <w:i w:val="0"/>
+          <w:iCs w:val="0"/>
+          <w:color w:val="000000"/>
+          <w:sz w:val="21"/>
+          <w:szCs w:val="21"/>
+        </w:rPr>
+        <w:t>S1 螺旋升级·定向断供（概率 25%）</w:t>
+      </w:r>
+    </w:p>
+    <w:p>
+      <w:pPr>
+        <w:numPr>
+          <w:ilvl w:val="0"/>
+          <w:numId w:val="7"/>
+        </w:numPr>
+        <w:spacing w:after="60"/>
+        <w:ind w:left="720" w:hanging="360"/>
+        <w:rPr>
+          <w:rFonts w:ascii="宋体" w:hAnsi="宋体" w:eastAsia="宋体" w:cs="宋体"/>
+          <w:sz w:val="21"/>
+          <w:szCs w:val="21"/>
+        </w:rPr>
+      </w:pPr>
+      <w:r>
+        <w:rPr>
+          <w:rFonts w:ascii="黑体" w:hAnsi="黑体" w:eastAsia="黑体" w:cs="黑体"/>
+          <w:b/>
+          <w:bCs/>
+          <w:i w:val="0"/>
+          <w:iCs w:val="0"/>
+          <w:color w:val="000000"/>
+          <w:sz w:val="21"/>
+          <w:szCs w:val="21"/>
+        </w:rPr>
+        <w:t>形态</w:t>
+      </w:r>
+      <w:r>
+        <w:rPr>
+          <w:rFonts w:ascii="宋体" w:hAnsi="宋体" w:eastAsia="宋体" w:cs="宋体"/>
+          <w:b w:val="0"/>
+          <w:bCs w:val="0"/>
+          <w:i w:val="0"/>
+          <w:iCs w:val="0"/>
+          <w:color w:val="000000"/>
+          <w:sz w:val="21"/>
+          <w:szCs w:val="21"/>
+        </w:rPr>
+        <w:t>：台海/南海/科技制裁某事件触发中国对</w:t>
+      </w:r>
+      <w:r>
+        <w:rPr>
+          <w:rFonts w:ascii="黑体" w:hAnsi="黑体" w:eastAsia="黑体" w:cs="黑体"/>
+          <w:b/>
+          <w:bCs/>
+          <w:i w:val="0"/>
+          <w:iCs w:val="0"/>
+          <w:color w:val="000000"/>
+          <w:sz w:val="21"/>
+          <w:szCs w:val="21"/>
+        </w:rPr>
+        <w:t>特定国家</w:t>
+      </w:r>
+      <w:r>
+        <w:rPr>
+          <w:rFonts w:ascii="宋体" w:hAnsi="宋体" w:eastAsia="宋体" w:cs="宋体"/>
+          <w:b w:val="0"/>
+          <w:bCs w:val="0"/>
+          <w:i w:val="0"/>
+          <w:iCs w:val="0"/>
+          <w:color w:val="000000"/>
+          <w:sz w:val="21"/>
+          <w:szCs w:val="21"/>
+        </w:rPr>
+        <w:t>（如日本、美国）特定物项（如高纯钨、中重稀土、镓锗）实施"原则上不予许可"，并启动</w:t>
+      </w:r>
+      <w:r>
+        <w:rPr>
+          <w:rFonts w:ascii="黑体" w:hAnsi="黑体" w:eastAsia="黑体" w:cs="黑体"/>
+          <w:b/>
+          <w:bCs/>
+          <w:i w:val="0"/>
+          <w:iCs w:val="0"/>
+          <w:color w:val="000000"/>
+          <w:sz w:val="21"/>
+          <w:szCs w:val="21"/>
+        </w:rPr>
+        <w:t>域外管辖</w:t>
+      </w:r>
+      <w:r>
+        <w:rPr>
+          <w:rFonts w:ascii="宋体" w:hAnsi="宋体" w:eastAsia="宋体" w:cs="宋体"/>
+          <w:b w:val="0"/>
+          <w:bCs w:val="0"/>
+          <w:i w:val="0"/>
+          <w:iCs w:val="0"/>
+          <w:color w:val="000000"/>
+          <w:sz w:val="21"/>
+          <w:szCs w:val="21"/>
+        </w:rPr>
+        <w:t>追责第三国转运。</w:t>
+      </w:r>
+    </w:p>
+    <w:p>
+      <w:pPr>
+        <w:numPr>
+          <w:ilvl w:val="0"/>
+          <w:numId w:val="7"/>
+        </w:numPr>
+        <w:spacing w:after="60"/>
+        <w:ind w:left="720" w:hanging="360"/>
+        <w:rPr>
+          <w:rFonts w:ascii="宋体" w:hAnsi="宋体" w:eastAsia="宋体" w:cs="宋体"/>
+          <w:sz w:val="21"/>
+          <w:szCs w:val="21"/>
+        </w:rPr>
+      </w:pPr>
+      <w:r>
+        <w:rPr>
+          <w:rFonts w:ascii="黑体" w:hAnsi="黑体" w:eastAsia="黑体" w:cs="黑体"/>
+          <w:b/>
+          <w:bCs/>
+          <w:i w:val="0"/>
+          <w:iCs w:val="0"/>
+          <w:color w:val="000000"/>
+          <w:sz w:val="21"/>
+          <w:szCs w:val="21"/>
+        </w:rPr>
+        <w:t>管制手法</w:t>
+      </w:r>
+      <w:r>
+        <w:rPr>
+          <w:rFonts w:ascii="宋体" w:hAnsi="宋体" w:eastAsia="宋体" w:cs="宋体"/>
+          <w:b w:val="0"/>
+          <w:bCs w:val="0"/>
+          <w:i w:val="0"/>
+          <w:iCs w:val="0"/>
+          <w:color w:val="000000"/>
+          <w:sz w:val="21"/>
+          <w:szCs w:val="21"/>
+        </w:rPr>
+        <w:t>：复制 2025 对美 46 号公告（暂停—恢复）的"脉冲式"精准打击；对韩/日等中转国施压，要求其承诺不转口（呼应前期"韩转日"叙事）。</w:t>
+      </w:r>
+    </w:p>
+    <w:p>
+      <w:pPr>
+        <w:numPr>
+          <w:ilvl w:val="0"/>
+          <w:numId w:val="7"/>
+        </w:numPr>
+        <w:spacing w:after="60"/>
+        <w:ind w:left="720" w:hanging="360"/>
+        <w:rPr>
+          <w:rFonts w:ascii="宋体" w:hAnsi="宋体" w:eastAsia="宋体" w:cs="宋体"/>
+          <w:sz w:val="21"/>
+          <w:szCs w:val="21"/>
+        </w:rPr>
+      </w:pPr>
+      <w:r>
+        <w:rPr>
+          <w:rFonts w:ascii="黑体" w:hAnsi="黑体" w:eastAsia="黑体" w:cs="黑体"/>
+          <w:b/>
+          <w:bCs/>
+          <w:i w:val="0"/>
+          <w:iCs w:val="0"/>
+          <w:color w:val="000000"/>
+          <w:sz w:val="21"/>
+          <w:szCs w:val="21"/>
+        </w:rPr>
+        <w:t>反制形态</w:t>
+      </w:r>
+      <w:r>
+        <w:rPr>
+          <w:rFonts w:ascii="宋体" w:hAnsi="宋体" w:eastAsia="宋体" w:cs="宋体"/>
+          <w:b w:val="0"/>
+          <w:bCs w:val="0"/>
+          <w:i w:val="0"/>
+          <w:iCs w:val="0"/>
+          <w:color w:val="000000"/>
+          <w:sz w:val="21"/>
+          <w:szCs w:val="21"/>
+        </w:rPr>
+        <w:t>：美日启动储备投放、加速盟友产能；西方对中国光伏/电池/电动车发起对等矿产壁垒；WTO 诉讼常态化但执行薄弱。</w:t>
+      </w:r>
+    </w:p>
+    <w:p>
+      <w:pPr>
+        <w:numPr>
+          <w:ilvl w:val="0"/>
+          <w:numId w:val="7"/>
+        </w:numPr>
+        <w:spacing w:after="60"/>
+        <w:ind w:left="720" w:hanging="360"/>
+        <w:rPr>
+          <w:rFonts w:ascii="宋体" w:hAnsi="宋体" w:eastAsia="宋体" w:cs="宋体"/>
+          <w:sz w:val="21"/>
+          <w:szCs w:val="21"/>
+        </w:rPr>
+      </w:pPr>
+      <w:r>
+        <w:rPr>
+          <w:rFonts w:ascii="黑体" w:hAnsi="黑体" w:eastAsia="黑体" w:cs="黑体"/>
+          <w:b/>
+          <w:bCs/>
+          <w:i w:val="0"/>
+          <w:iCs w:val="0"/>
+          <w:color w:val="000000"/>
+          <w:sz w:val="21"/>
+          <w:szCs w:val="21"/>
+        </w:rPr>
+        <w:t>海关含义</w:t>
+      </w:r>
+      <w:r>
+        <w:rPr>
+          <w:rFonts w:ascii="宋体" w:hAnsi="宋体" w:eastAsia="宋体" w:cs="宋体"/>
+          <w:b w:val="0"/>
+          <w:bCs w:val="0"/>
+          <w:i w:val="0"/>
+          <w:iCs w:val="0"/>
+          <w:color w:val="000000"/>
+          <w:sz w:val="21"/>
+          <w:szCs w:val="21"/>
+        </w:rPr>
+        <w:t>：</w:t>
+      </w:r>
+      <w:r>
+        <w:rPr>
+          <w:rFonts w:ascii="黑体" w:hAnsi="黑体" w:eastAsia="黑体" w:cs="黑体"/>
+          <w:b/>
+          <w:bCs/>
+          <w:i w:val="0"/>
+          <w:iCs w:val="0"/>
+          <w:color w:val="000000"/>
+          <w:sz w:val="21"/>
+          <w:szCs w:val="21"/>
+        </w:rPr>
+        <w:t>短期内查发量暴增</w:t>
+      </w:r>
+      <w:r>
+        <w:rPr>
+          <w:rFonts w:ascii="宋体" w:hAnsi="宋体" w:eastAsia="宋体" w:cs="宋体"/>
+          <w:b w:val="0"/>
+          <w:bCs w:val="0"/>
+          <w:i w:val="0"/>
+          <w:iCs w:val="0"/>
+          <w:color w:val="000000"/>
+          <w:sz w:val="21"/>
+          <w:szCs w:val="21"/>
+        </w:rPr>
+        <w:t>，绕道（经东盟、墨西哥）与伪报（以"合金/制品/样品"伪装）手法升级；需预设"突发管制+追溯既往申报3年"的应急核查预案。</w:t>
+      </w:r>
+    </w:p>
+    <w:p>
+      <w:pPr>
+        <w:numPr>
+          <w:ilvl w:val="0"/>
+          <w:numId w:val="7"/>
+        </w:numPr>
+        <w:spacing w:after="60"/>
+        <w:ind w:left="720" w:hanging="360"/>
+        <w:rPr>
+          <w:rFonts w:ascii="宋体" w:hAnsi="宋体" w:eastAsia="宋体" w:cs="宋体"/>
+          <w:sz w:val="21"/>
+          <w:szCs w:val="21"/>
+        </w:rPr>
+      </w:pPr>
+      <w:r>
+        <w:rPr>
+          <w:rFonts w:ascii="黑体" w:hAnsi="黑体" w:eastAsia="黑体" w:cs="黑体"/>
+          <w:b/>
+          <w:bCs/>
+          <w:i w:val="0"/>
+          <w:iCs w:val="0"/>
+          <w:color w:val="000000"/>
+          <w:sz w:val="21"/>
+          <w:szCs w:val="21"/>
+        </w:rPr>
+        <w:t>触发条件</w:t>
+      </w:r>
+      <w:r>
+        <w:rPr>
+          <w:rFonts w:ascii="宋体" w:hAnsi="宋体" w:eastAsia="宋体" w:cs="宋体"/>
+          <w:b w:val="0"/>
+          <w:bCs w:val="0"/>
+          <w:i w:val="0"/>
+          <w:iCs w:val="0"/>
+          <w:color w:val="000000"/>
+          <w:sz w:val="21"/>
+          <w:szCs w:val="21"/>
+        </w:rPr>
+        <w:t>：重大地缘危机或科技"脱钩"临界点。</w:t>
+      </w:r>
+    </w:p>
+    <w:p>
+      <w:pPr>
+        <w:spacing w:before="200" w:after="120"/>
+        <w:outlineLvl w:val="1"/>
+        <w:rPr>
+          <w:rFonts w:ascii="黑体" w:hAnsi="黑体" w:eastAsia="黑体" w:cs="黑体"/>
+          <w:b/>
+          <w:bCs/>
+          <w:color w:val="2E5E8C"/>
+          <w:sz w:val="24"/>
+          <w:szCs w:val="24"/>
+        </w:rPr>
+      </w:pPr>
+      <w:r>
+        <w:rPr>
+          <w:rFonts w:ascii="宋体" w:hAnsi="宋体" w:eastAsia="宋体" w:cs="宋体"/>
+          <w:b w:val="0"/>
+          <w:bCs w:val="0"/>
+          <w:i w:val="0"/>
+          <w:iCs w:val="0"/>
+          <w:color w:val="000000"/>
+          <w:sz w:val="21"/>
+          <w:szCs w:val="21"/>
+        </w:rPr>
+        <w:t>S2 阵营化·平行体系（概率 18%）</w:t>
+      </w:r>
+    </w:p>
+    <w:p>
+      <w:pPr>
+        <w:numPr>
+          <w:ilvl w:val="0"/>
+          <w:numId w:val="7"/>
+        </w:numPr>
+        <w:spacing w:after="60"/>
+        <w:ind w:left="720" w:hanging="360"/>
+        <w:rPr>
+          <w:rFonts w:ascii="宋体" w:hAnsi="宋体" w:eastAsia="宋体" w:cs="宋体"/>
+          <w:sz w:val="21"/>
+          <w:szCs w:val="21"/>
+        </w:rPr>
+      </w:pPr>
+      <w:r>
+        <w:rPr>
+          <w:rFonts w:ascii="黑体" w:hAnsi="黑体" w:eastAsia="黑体" w:cs="黑体"/>
+          <w:b/>
+          <w:bCs/>
+          <w:i w:val="0"/>
+          <w:iCs w:val="0"/>
+          <w:color w:val="000000"/>
+          <w:sz w:val="21"/>
+          <w:szCs w:val="21"/>
+        </w:rPr>
+        <w:t>形态</w:t>
+      </w:r>
+      <w:r>
+        <w:rPr>
+          <w:rFonts w:ascii="宋体" w:hAnsi="宋体" w:eastAsia="宋体" w:cs="宋体"/>
+          <w:b w:val="0"/>
+          <w:bCs w:val="0"/>
+          <w:i w:val="0"/>
+          <w:iCs w:val="0"/>
+          <w:color w:val="000000"/>
+          <w:sz w:val="21"/>
+          <w:szCs w:val="21"/>
+        </w:rPr>
+        <w:t>：中美各建排他性矿产集团（中方：资源国+全球南方；美方：G7+伙伴国），第三方被迫选边；多边贸易规则失效，</w:t>
+      </w:r>
+      <w:r>
+        <w:rPr>
+          <w:rFonts w:ascii="黑体" w:hAnsi="黑体" w:eastAsia="黑体" w:cs="黑体"/>
+          <w:b/>
+          <w:bCs/>
+          <w:i w:val="0"/>
+          <w:iCs w:val="0"/>
+          <w:color w:val="000000"/>
+          <w:sz w:val="21"/>
+          <w:szCs w:val="21"/>
+        </w:rPr>
+        <w:t>矿产成为"经济北约"核心资产</w:t>
+      </w:r>
+      <w:r>
+        <w:rPr>
+          <w:rFonts w:ascii="宋体" w:hAnsi="宋体" w:eastAsia="宋体" w:cs="宋体"/>
+          <w:b w:val="0"/>
+          <w:bCs w:val="0"/>
+          <w:i w:val="0"/>
+          <w:iCs w:val="0"/>
+          <w:color w:val="000000"/>
+          <w:sz w:val="21"/>
+          <w:szCs w:val="21"/>
+        </w:rPr>
+        <w:t>。</w:t>
+      </w:r>
+    </w:p>
+    <w:p>
+      <w:pPr>
+        <w:numPr>
+          <w:ilvl w:val="0"/>
+          <w:numId w:val="7"/>
+        </w:numPr>
+        <w:spacing w:after="60"/>
+        <w:ind w:left="720" w:hanging="360"/>
+        <w:rPr>
+          <w:rFonts w:ascii="宋体" w:hAnsi="宋体" w:eastAsia="宋体" w:cs="宋体"/>
+          <w:sz w:val="21"/>
+          <w:szCs w:val="21"/>
+        </w:rPr>
+      </w:pPr>
+      <w:r>
+        <w:rPr>
+          <w:rFonts w:ascii="黑体" w:hAnsi="黑体" w:eastAsia="黑体" w:cs="黑体"/>
+          <w:b/>
+          <w:bCs/>
+          <w:i w:val="0"/>
+          <w:iCs w:val="0"/>
+          <w:color w:val="000000"/>
+          <w:sz w:val="21"/>
+          <w:szCs w:val="21"/>
+        </w:rPr>
+        <w:t>管制手法</w:t>
+      </w:r>
+      <w:r>
+        <w:rPr>
+          <w:rFonts w:ascii="宋体" w:hAnsi="宋体" w:eastAsia="宋体" w:cs="宋体"/>
+          <w:b w:val="0"/>
+          <w:bCs w:val="0"/>
+          <w:i w:val="0"/>
+          <w:iCs w:val="0"/>
+          <w:color w:val="000000"/>
+          <w:sz w:val="21"/>
+          <w:szCs w:val="21"/>
+        </w:rPr>
+        <w:t>：管制与反制完全"阵营内豁免、阵营外封锁"；中国对阵营外实施最严许可，对"友好发展中国家"以资源换基建。</w:t>
+      </w:r>
+    </w:p>
+    <w:p>
+      <w:pPr>
+        <w:numPr>
+          <w:ilvl w:val="0"/>
+          <w:numId w:val="7"/>
+        </w:numPr>
+        <w:spacing w:after="60"/>
+        <w:ind w:left="720" w:hanging="360"/>
+        <w:rPr>
+          <w:rFonts w:ascii="宋体" w:hAnsi="宋体" w:eastAsia="宋体" w:cs="宋体"/>
+          <w:sz w:val="21"/>
+          <w:szCs w:val="21"/>
+        </w:rPr>
+      </w:pPr>
+      <w:r>
+        <w:rPr>
+          <w:rFonts w:ascii="黑体" w:hAnsi="黑体" w:eastAsia="黑体" w:cs="黑体"/>
+          <w:b/>
+          <w:bCs/>
+          <w:i w:val="0"/>
+          <w:iCs w:val="0"/>
+          <w:color w:val="000000"/>
+          <w:sz w:val="21"/>
+          <w:szCs w:val="21"/>
+        </w:rPr>
+        <w:t>反制形态</w:t>
+      </w:r>
+      <w:r>
+        <w:rPr>
+          <w:rFonts w:ascii="宋体" w:hAnsi="宋体" w:eastAsia="宋体" w:cs="宋体"/>
+          <w:b w:val="0"/>
+          <w:bCs w:val="0"/>
+          <w:i w:val="0"/>
+          <w:iCs w:val="0"/>
+          <w:color w:val="000000"/>
+          <w:sz w:val="21"/>
+          <w:szCs w:val="21"/>
+        </w:rPr>
+        <w:t>：西方对中国企业实施"矿产来源尽职调查"强制法案（类比强迫劳动法案），以"人权/强迫劳动"为由封堵中国矿产；形成"你管制、我立法禁"的镜像对抗。</w:t>
+      </w:r>
+    </w:p>
+    <w:p>
+      <w:pPr>
+        <w:numPr>
+          <w:ilvl w:val="0"/>
+          <w:numId w:val="7"/>
+        </w:numPr>
+        <w:spacing w:after="60"/>
+        <w:ind w:left="720" w:hanging="360"/>
+        <w:rPr>
+          <w:rFonts w:ascii="宋体" w:hAnsi="宋体" w:eastAsia="宋体" w:cs="宋体"/>
+          <w:sz w:val="21"/>
+          <w:szCs w:val="21"/>
+        </w:rPr>
+      </w:pPr>
+      <w:r>
+        <w:rPr>
+          <w:rFonts w:ascii="黑体" w:hAnsi="黑体" w:eastAsia="黑体" w:cs="黑体"/>
+          <w:b/>
+          <w:bCs/>
+          <w:i w:val="0"/>
+          <w:iCs w:val="0"/>
+          <w:color w:val="000000"/>
+          <w:sz w:val="21"/>
+          <w:szCs w:val="21"/>
+        </w:rPr>
+        <w:t>海关含义</w:t>
+      </w:r>
+      <w:r>
+        <w:rPr>
+          <w:rFonts w:ascii="宋体" w:hAnsi="宋体" w:eastAsia="宋体" w:cs="宋体"/>
+          <w:b w:val="0"/>
+          <w:bCs w:val="0"/>
+          <w:i w:val="0"/>
+          <w:iCs w:val="0"/>
+          <w:color w:val="000000"/>
+          <w:sz w:val="21"/>
+          <w:szCs w:val="21"/>
+        </w:rPr>
+        <w:t>：海关从"贸易监管"转为"战略前线"，需与国安、商务、外交协同；第三国绕道成为系统风险，集装箱/提单溯源、终用户穿透成为核心能力。</w:t>
+      </w:r>
+    </w:p>
+    <w:p>
+      <w:pPr>
+        <w:numPr>
+          <w:ilvl w:val="0"/>
+          <w:numId w:val="7"/>
+        </w:numPr>
+        <w:spacing w:after="60"/>
+        <w:ind w:left="720" w:hanging="360"/>
+        <w:rPr>
+          <w:rFonts w:ascii="宋体" w:hAnsi="宋体" w:eastAsia="宋体" w:cs="宋体"/>
+          <w:sz w:val="21"/>
+          <w:szCs w:val="21"/>
+        </w:rPr>
+      </w:pPr>
+      <w:r>
+        <w:rPr>
+          <w:rFonts w:ascii="黑体" w:hAnsi="黑体" w:eastAsia="黑体" w:cs="黑体"/>
+          <w:b/>
+          <w:bCs/>
+          <w:i w:val="0"/>
+          <w:iCs w:val="0"/>
+          <w:color w:val="000000"/>
+          <w:sz w:val="21"/>
+          <w:szCs w:val="21"/>
+        </w:rPr>
+        <w:t>触发条件</w:t>
+      </w:r>
+      <w:r>
+        <w:rPr>
+          <w:rFonts w:ascii="宋体" w:hAnsi="宋体" w:eastAsia="宋体" w:cs="宋体"/>
+          <w:b w:val="0"/>
+          <w:bCs w:val="0"/>
+          <w:i w:val="0"/>
+          <w:iCs w:val="0"/>
+          <w:color w:val="000000"/>
+          <w:sz w:val="21"/>
+          <w:szCs w:val="21"/>
+        </w:rPr>
+        <w:t>：脱钩论主导、多边机制崩溃。</w:t>
+      </w:r>
+    </w:p>
+    <w:p>
+      <w:pPr>
+        <w:spacing w:before="200" w:after="120"/>
+        <w:outlineLvl w:val="1"/>
+        <w:rPr>
+          <w:rFonts w:ascii="黑体" w:hAnsi="黑体" w:eastAsia="黑体" w:cs="黑体"/>
+          <w:b/>
+          <w:bCs/>
+          <w:color w:val="2E5E8C"/>
+          <w:sz w:val="24"/>
+          <w:szCs w:val="24"/>
+        </w:rPr>
+      </w:pPr>
+      <w:r>
+        <w:rPr>
+          <w:rFonts w:ascii="宋体" w:hAnsi="宋体" w:eastAsia="宋体" w:cs="宋体"/>
+          <w:b w:val="0"/>
+          <w:bCs w:val="0"/>
+          <w:i w:val="0"/>
+          <w:iCs w:val="0"/>
+          <w:color w:val="000000"/>
+          <w:sz w:val="21"/>
+          <w:szCs w:val="21"/>
+        </w:rPr>
+        <w:t>S3 缓和·规则共治（概率 8%）</w:t>
+      </w:r>
+    </w:p>
+    <w:p>
+      <w:pPr>
+        <w:numPr>
+          <w:ilvl w:val="0"/>
+          <w:numId w:val="7"/>
+        </w:numPr>
+        <w:spacing w:after="60"/>
+        <w:ind w:left="720" w:hanging="360"/>
+        <w:rPr>
+          <w:rFonts w:ascii="宋体" w:hAnsi="宋体" w:eastAsia="宋体" w:cs="宋体"/>
+          <w:sz w:val="21"/>
+          <w:szCs w:val="21"/>
+        </w:rPr>
+      </w:pPr>
+      <w:r>
+        <w:rPr>
+          <w:rFonts w:ascii="黑体" w:hAnsi="黑体" w:eastAsia="黑体" w:cs="黑体"/>
+          <w:b/>
+          <w:bCs/>
+          <w:i w:val="0"/>
+          <w:iCs w:val="0"/>
+          <w:color w:val="000000"/>
+          <w:sz w:val="21"/>
+          <w:szCs w:val="21"/>
+        </w:rPr>
+        <w:t>形态</w:t>
+      </w:r>
+      <w:r>
+        <w:rPr>
+          <w:rFonts w:ascii="宋体" w:hAnsi="宋体" w:eastAsia="宋体" w:cs="宋体"/>
+          <w:b w:val="0"/>
+          <w:bCs w:val="0"/>
+          <w:i w:val="0"/>
+          <w:iCs w:val="0"/>
+          <w:color w:val="000000"/>
+          <w:sz w:val="21"/>
+          <w:szCs w:val="21"/>
+        </w:rPr>
+        <w:t>：某次供给危机（如新能源/军工断料）倒逼中美欧建立"关键矿产稳定对话"，设定配额、价格区间与危机缓冲。</w:t>
+      </w:r>
+    </w:p>
+    <w:p>
+      <w:pPr>
+        <w:numPr>
+          <w:ilvl w:val="0"/>
+          <w:numId w:val="7"/>
+        </w:numPr>
+        <w:spacing w:after="60"/>
+        <w:ind w:left="720" w:hanging="360"/>
+        <w:rPr>
+          <w:rFonts w:ascii="宋体" w:hAnsi="宋体" w:eastAsia="宋体" w:cs="宋体"/>
+          <w:sz w:val="21"/>
+          <w:szCs w:val="21"/>
+        </w:rPr>
+      </w:pPr>
+      <w:r>
+        <w:rPr>
+          <w:rFonts w:ascii="黑体" w:hAnsi="黑体" w:eastAsia="黑体" w:cs="黑体"/>
+          <w:b/>
+          <w:bCs/>
+          <w:i w:val="0"/>
+          <w:iCs w:val="0"/>
+          <w:color w:val="000000"/>
+          <w:sz w:val="21"/>
+          <w:szCs w:val="21"/>
+        </w:rPr>
+        <w:t>管制手法</w:t>
+      </w:r>
+      <w:r>
+        <w:rPr>
+          <w:rFonts w:ascii="宋体" w:hAnsi="宋体" w:eastAsia="宋体" w:cs="宋体"/>
+          <w:b w:val="0"/>
+          <w:bCs w:val="0"/>
+          <w:i w:val="0"/>
+          <w:iCs w:val="0"/>
+          <w:color w:val="000000"/>
+          <w:sz w:val="21"/>
+          <w:szCs w:val="21"/>
+        </w:rPr>
+        <w:t>：从"武器化"回归"管理化"，清单收敛，许可证互认试点。</w:t>
+      </w:r>
+    </w:p>
+    <w:p>
+      <w:pPr>
+        <w:numPr>
+          <w:ilvl w:val="0"/>
+          <w:numId w:val="7"/>
+        </w:numPr>
+        <w:spacing w:after="60"/>
+        <w:ind w:left="720" w:hanging="360"/>
+        <w:rPr>
+          <w:rFonts w:ascii="宋体" w:hAnsi="宋体" w:eastAsia="宋体" w:cs="宋体"/>
+          <w:sz w:val="21"/>
+          <w:szCs w:val="21"/>
+        </w:rPr>
+      </w:pPr>
+      <w:r>
+        <w:rPr>
+          <w:rFonts w:ascii="黑体" w:hAnsi="黑体" w:eastAsia="黑体" w:cs="黑体"/>
+          <w:b/>
+          <w:bCs/>
+          <w:i w:val="0"/>
+          <w:iCs w:val="0"/>
+          <w:color w:val="000000"/>
+          <w:sz w:val="21"/>
+          <w:szCs w:val="21"/>
+        </w:rPr>
+        <w:t>反制形态</w:t>
+      </w:r>
+      <w:r>
+        <w:rPr>
+          <w:rFonts w:ascii="宋体" w:hAnsi="宋体" w:eastAsia="宋体" w:cs="宋体"/>
+          <w:b w:val="0"/>
+          <w:bCs w:val="0"/>
+          <w:i w:val="0"/>
+          <w:iCs w:val="0"/>
+          <w:color w:val="000000"/>
+          <w:sz w:val="21"/>
+          <w:szCs w:val="21"/>
+        </w:rPr>
+        <w:t>：相互解除部分对等限制，建立"矿产北约式"透明机制。</w:t>
+      </w:r>
+    </w:p>
+    <w:p>
+      <w:pPr>
+        <w:numPr>
+          <w:ilvl w:val="0"/>
+          <w:numId w:val="7"/>
+        </w:numPr>
+        <w:spacing w:after="60"/>
+        <w:ind w:left="720" w:hanging="360"/>
+        <w:rPr>
+          <w:rFonts w:ascii="宋体" w:hAnsi="宋体" w:eastAsia="宋体" w:cs="宋体"/>
+          <w:sz w:val="21"/>
+          <w:szCs w:val="21"/>
+        </w:rPr>
+      </w:pPr>
+      <w:r>
+        <w:rPr>
+          <w:rFonts w:ascii="黑体" w:hAnsi="黑体" w:eastAsia="黑体" w:cs="黑体"/>
+          <w:b/>
+          <w:bCs/>
+          <w:i w:val="0"/>
+          <w:iCs w:val="0"/>
+          <w:color w:val="000000"/>
+          <w:sz w:val="21"/>
+          <w:szCs w:val="21"/>
+        </w:rPr>
+        <w:t>海关含义</w:t>
+      </w:r>
+      <w:r>
+        <w:rPr>
+          <w:rFonts w:ascii="宋体" w:hAnsi="宋体" w:eastAsia="宋体" w:cs="宋体"/>
+          <w:b w:val="0"/>
+          <w:bCs w:val="0"/>
+          <w:i w:val="0"/>
+          <w:iCs w:val="0"/>
+          <w:color w:val="000000"/>
+          <w:sz w:val="21"/>
+          <w:szCs w:val="21"/>
+        </w:rPr>
+        <w:t>：监管回归合规导向，重点转为"防欺诈"而非"防流出"。</w:t>
+      </w:r>
+    </w:p>
+    <w:p>
+      <w:pPr>
+        <w:numPr>
+          <w:ilvl w:val="0"/>
+          <w:numId w:val="7"/>
+        </w:numPr>
+        <w:spacing w:after="60"/>
+        <w:ind w:left="720" w:hanging="360"/>
+        <w:rPr>
+          <w:rFonts w:ascii="宋体" w:hAnsi="宋体" w:eastAsia="宋体" w:cs="宋体"/>
+          <w:sz w:val="21"/>
+          <w:szCs w:val="21"/>
+        </w:rPr>
+      </w:pPr>
+      <w:r>
+        <w:rPr>
+          <w:rFonts w:ascii="黑体" w:hAnsi="黑体" w:eastAsia="黑体" w:cs="黑体"/>
+          <w:b/>
+          <w:bCs/>
+          <w:i w:val="0"/>
+          <w:iCs w:val="0"/>
+          <w:color w:val="000000"/>
+          <w:sz w:val="21"/>
+          <w:szCs w:val="21"/>
+        </w:rPr>
+        <w:t>触发条件</w:t>
+      </w:r>
+      <w:r>
+        <w:rPr>
+          <w:rFonts w:ascii="宋体" w:hAnsi="宋体" w:eastAsia="宋体" w:cs="宋体"/>
+          <w:b w:val="0"/>
+          <w:bCs w:val="0"/>
+          <w:i w:val="0"/>
+          <w:iCs w:val="0"/>
+          <w:color w:val="000000"/>
+          <w:sz w:val="21"/>
+          <w:szCs w:val="21"/>
+        </w:rPr>
+        <w:t>：双方均承受不住通胀/产业断链代价，政治意愿转向。</w:t>
+      </w:r>
+    </w:p>
+    <w:p>
+      <w:pPr>
+        <w:spacing w:before="200" w:after="120"/>
+        <w:outlineLvl w:val="1"/>
+        <w:rPr>
+          <w:rFonts w:ascii="黑体" w:hAnsi="黑体" w:eastAsia="黑体" w:cs="黑体"/>
+          <w:b/>
+          <w:bCs/>
+          <w:color w:val="2E5E8C"/>
+          <w:sz w:val="24"/>
+          <w:szCs w:val="24"/>
+        </w:rPr>
+      </w:pPr>
+      <w:r>
+        <w:rPr>
+          <w:rFonts w:ascii="宋体" w:hAnsi="宋体" w:eastAsia="宋体" w:cs="宋体"/>
+          <w:b w:val="0"/>
+          <w:bCs w:val="0"/>
+          <w:i w:val="0"/>
+          <w:iCs w:val="0"/>
+          <w:color w:val="000000"/>
+          <w:sz w:val="21"/>
+          <w:szCs w:val="21"/>
+        </w:rPr>
+        <w:t>S4 技术替代·需求塌方（概率 4%）</w:t>
+      </w:r>
+    </w:p>
+    <w:p>
+      <w:pPr>
+        <w:numPr>
+          <w:ilvl w:val="0"/>
+          <w:numId w:val="7"/>
+        </w:numPr>
+        <w:spacing w:after="60"/>
+        <w:ind w:left="720" w:hanging="360"/>
+        <w:rPr>
+          <w:rFonts w:ascii="宋体" w:hAnsi="宋体" w:eastAsia="宋体" w:cs="宋体"/>
+          <w:sz w:val="21"/>
+          <w:szCs w:val="21"/>
+        </w:rPr>
+      </w:pPr>
+      <w:r>
+        <w:rPr>
+          <w:rFonts w:ascii="黑体" w:hAnsi="黑体" w:eastAsia="黑体" w:cs="黑体"/>
+          <w:b/>
+          <w:bCs/>
+          <w:i w:val="0"/>
+          <w:iCs w:val="0"/>
+          <w:color w:val="000000"/>
+          <w:sz w:val="21"/>
+          <w:szCs w:val="21"/>
+        </w:rPr>
+        <w:t>形态</w:t>
+      </w:r>
+      <w:r>
+        <w:rPr>
+          <w:rFonts w:ascii="宋体" w:hAnsi="宋体" w:eastAsia="宋体" w:cs="宋体"/>
+          <w:b w:val="0"/>
+          <w:bCs w:val="0"/>
+          <w:i w:val="0"/>
+          <w:iCs w:val="0"/>
+          <w:color w:val="000000"/>
+          <w:sz w:val="21"/>
+          <w:szCs w:val="21"/>
+        </w:rPr>
+        <w:t>：城市矿山（回收）、合成材料、减量化设计在 2030 前取得突破，</w:t>
+      </w:r>
+      <w:r>
+        <w:rPr>
+          <w:rFonts w:ascii="黑体" w:hAnsi="黑体" w:eastAsia="黑体" w:cs="黑体"/>
+          <w:b/>
+          <w:bCs/>
+          <w:i w:val="0"/>
+          <w:iCs w:val="0"/>
+          <w:color w:val="000000"/>
+          <w:sz w:val="21"/>
+          <w:szCs w:val="21"/>
+        </w:rPr>
+        <w:t>中国加工垄断红利衰减</w:t>
+      </w:r>
+      <w:r>
+        <w:rPr>
+          <w:rFonts w:ascii="宋体" w:hAnsi="宋体" w:eastAsia="宋体" w:cs="宋体"/>
+          <w:b w:val="0"/>
+          <w:bCs w:val="0"/>
+          <w:i w:val="0"/>
+          <w:iCs w:val="0"/>
+          <w:color w:val="000000"/>
+          <w:sz w:val="21"/>
+          <w:szCs w:val="21"/>
+        </w:rPr>
+        <w:t>；管制博弈重心转移至"标准与回收技术"而非"原矿"。</w:t>
+      </w:r>
+    </w:p>
+    <w:p>
+      <w:pPr>
+        <w:numPr>
+          <w:ilvl w:val="0"/>
+          <w:numId w:val="7"/>
+        </w:numPr>
+        <w:spacing w:after="60"/>
+        <w:ind w:left="720" w:hanging="360"/>
+        <w:rPr>
+          <w:rFonts w:ascii="宋体" w:hAnsi="宋体" w:eastAsia="宋体" w:cs="宋体"/>
+          <w:sz w:val="21"/>
+          <w:szCs w:val="21"/>
+        </w:rPr>
+      </w:pPr>
+      <w:r>
+        <w:rPr>
+          <w:rFonts w:ascii="黑体" w:hAnsi="黑体" w:eastAsia="黑体" w:cs="黑体"/>
+          <w:b/>
+          <w:bCs/>
+          <w:i w:val="0"/>
+          <w:iCs w:val="0"/>
+          <w:color w:val="000000"/>
+          <w:sz w:val="21"/>
+          <w:szCs w:val="21"/>
+        </w:rPr>
+        <w:t>管制手法</w:t>
+      </w:r>
+      <w:r>
+        <w:rPr>
+          <w:rFonts w:ascii="宋体" w:hAnsi="宋体" w:eastAsia="宋体" w:cs="宋体"/>
+          <w:b w:val="0"/>
+          <w:bCs w:val="0"/>
+          <w:i w:val="0"/>
+          <w:iCs w:val="0"/>
+          <w:color w:val="000000"/>
+          <w:sz w:val="21"/>
+          <w:szCs w:val="21"/>
+        </w:rPr>
+        <w:t>：原矿管制边际效用下降，重心转向"回收料/再生料"与"加工技术"出口管制（呼应 26号公告对再生钨的监管空白补全）。</w:t>
+      </w:r>
+    </w:p>
+    <w:p>
+      <w:pPr>
+        <w:numPr>
+          <w:ilvl w:val="0"/>
+          <w:numId w:val="7"/>
+        </w:numPr>
+        <w:spacing w:after="60"/>
+        <w:ind w:left="720" w:hanging="360"/>
+        <w:rPr>
+          <w:rFonts w:ascii="宋体" w:hAnsi="宋体" w:eastAsia="宋体" w:cs="宋体"/>
+          <w:sz w:val="21"/>
+          <w:szCs w:val="21"/>
+        </w:rPr>
+      </w:pPr>
+      <w:r>
+        <w:rPr>
+          <w:rFonts w:ascii="黑体" w:hAnsi="黑体" w:eastAsia="黑体" w:cs="黑体"/>
+          <w:b/>
+          <w:bCs/>
+          <w:i w:val="0"/>
+          <w:iCs w:val="0"/>
+          <w:color w:val="000000"/>
+          <w:sz w:val="21"/>
+          <w:szCs w:val="21"/>
+        </w:rPr>
+        <w:t>反制形态</w:t>
+      </w:r>
+      <w:r>
+        <w:rPr>
+          <w:rFonts w:ascii="宋体" w:hAnsi="宋体" w:eastAsia="宋体" w:cs="宋体"/>
+          <w:b w:val="0"/>
+          <w:bCs w:val="0"/>
+          <w:i w:val="0"/>
+          <w:iCs w:val="0"/>
+          <w:color w:val="000000"/>
+          <w:sz w:val="21"/>
+          <w:szCs w:val="21"/>
+        </w:rPr>
+        <w:t>：西方以"绿色标准"反制中国冶炼产能（碳关税+负责任矿产）。</w:t>
+      </w:r>
+    </w:p>
+    <w:p>
+      <w:pPr>
+        <w:numPr>
+          <w:ilvl w:val="0"/>
+          <w:numId w:val="7"/>
+        </w:numPr>
+        <w:spacing w:after="60"/>
+        <w:ind w:left="720" w:hanging="360"/>
+        <w:rPr>
+          <w:rFonts w:ascii="宋体" w:hAnsi="宋体" w:eastAsia="宋体" w:cs="宋体"/>
+          <w:sz w:val="21"/>
+          <w:szCs w:val="21"/>
+        </w:rPr>
+      </w:pPr>
+      <w:r>
+        <w:rPr>
+          <w:rFonts w:ascii="黑体" w:hAnsi="黑体" w:eastAsia="黑体" w:cs="黑体"/>
+          <w:b/>
+          <w:bCs/>
+          <w:i w:val="0"/>
+          <w:iCs w:val="0"/>
+          <w:color w:val="000000"/>
+          <w:sz w:val="21"/>
+          <w:szCs w:val="21"/>
+        </w:rPr>
+        <w:t>海关含义</w:t>
+      </w:r>
+      <w:r>
+        <w:rPr>
+          <w:rFonts w:ascii="宋体" w:hAnsi="宋体" w:eastAsia="宋体" w:cs="宋体"/>
+          <w:b w:val="0"/>
+          <w:bCs w:val="0"/>
+          <w:i w:val="0"/>
+          <w:iCs w:val="0"/>
+          <w:color w:val="000000"/>
+          <w:sz w:val="21"/>
+          <w:szCs w:val="21"/>
+        </w:rPr>
+        <w:t>：监管对象从"原矿/粉体"扩展到"废料的合法回流与再生品"，再生钨、再生稀土成为新盲区。</w:t>
+      </w:r>
+    </w:p>
+    <w:p>
+      <w:pPr>
+        <w:numPr>
+          <w:ilvl w:val="0"/>
+          <w:numId w:val="7"/>
+        </w:numPr>
+        <w:spacing w:after="60"/>
+        <w:ind w:left="720" w:hanging="360"/>
+        <w:rPr>
+          <w:rFonts w:ascii="宋体" w:hAnsi="宋体" w:eastAsia="宋体" w:cs="宋体"/>
+          <w:sz w:val="21"/>
+          <w:szCs w:val="21"/>
+        </w:rPr>
+      </w:pPr>
+      <w:r>
+        <w:rPr>
+          <w:rFonts w:ascii="黑体" w:hAnsi="黑体" w:eastAsia="黑体" w:cs="黑体"/>
+          <w:b/>
+          <w:bCs/>
+          <w:i w:val="0"/>
+          <w:iCs w:val="0"/>
+          <w:color w:val="000000"/>
+          <w:sz w:val="21"/>
+          <w:szCs w:val="21"/>
+        </w:rPr>
+        <w:t>触发条件</w:t>
+      </w:r>
+      <w:r>
+        <w:rPr>
+          <w:rFonts w:ascii="宋体" w:hAnsi="宋体" w:eastAsia="宋体" w:cs="宋体"/>
+          <w:b w:val="0"/>
+          <w:bCs w:val="0"/>
+          <w:i w:val="0"/>
+          <w:iCs w:val="0"/>
+          <w:color w:val="000000"/>
+          <w:sz w:val="21"/>
+          <w:szCs w:val="21"/>
+        </w:rPr>
+        <w:t>：回收率/替代材料技术突破超预期。</w:t>
       </w:r>
     </w:p>
     <w:p>
@@ -14819,6 +16508,20 @@
       </w:rPr>
     </w:lvl>
   </w:abstractNum>
+  <w:abstractNum w:abstractNumId="6">
+    <w:nsid w:val="0053208E"/>
+    <w:multiLevelType w:val="singleLevel"/>
+    <w:tmpl w:val="0053208E"/>
+    <w:lvl w:ilvl="0" w:tentative="0">
+      <w:start w:val="1"/>
+      <w:numFmt w:val="bullet"/>
+      <w:lvlText w:val="•"/>
+      <w:lvlJc w:val="left"/>
+      <w:pPr>
+        <w:ind w:left="720" w:hanging="360"/>
+      </w:pPr>
+    </w:lvl>
+  </w:abstractNum>
   <w:num w:numId="1">
     <w:abstractNumId w:val="1"/>
   </w:num>
@@ -14836,6 +16539,12 @@
   </w:num>
   <w:num w:numId="6">
     <w:abstractNumId w:val="3"/>
+  </w:num>
+  <w:num w:numId="7">
+    <w:abstractNumId w:val="6"/>
+    <w:lvlOverride w:ilvl="0">
+      <w:startOverride w:val="1"/>
+    </w:lvlOverride>
   </w:num>
 </w:numbering>
 </file>
@@ -14916,7 +16625,7 @@
     <w:lsdException w:qFormat="1" w:unhideWhenUsed="0" w:uiPriority="10" w:semiHidden="0" w:name="Title"/>
     <w:lsdException w:uiPriority="99" w:name="Closing"/>
     <w:lsdException w:uiPriority="99" w:name="Signature"/>
-    <w:lsdException w:uiPriority="1" w:name="Default Paragraph Font"/>
+    <w:lsdException w:qFormat="1" w:uiPriority="1" w:name="Default Paragraph Font"/>
     <w:lsdException w:qFormat="1" w:uiPriority="99" w:semiHidden="0" w:name="Body Text"/>
     <w:lsdException w:uiPriority="99" w:name="Body Text Indent"/>
     <w:lsdException w:qFormat="1" w:uiPriority="99" w:semiHidden="0" w:name="List Continue"/>
@@ -14932,7 +16641,7 @@
     <w:lsdException w:uiPriority="99" w:name="Body Text First Indent 2"/>
     <w:lsdException w:uiPriority="99" w:name="Note Heading"/>
     <w:lsdException w:qFormat="1" w:uiPriority="99" w:semiHidden="0" w:name="Body Text 2"/>
-    <w:lsdException w:uiPriority="99" w:semiHidden="0" w:name="Body Text 3"/>
+    <w:lsdException w:qFormat="1" w:uiPriority="99" w:semiHidden="0" w:name="Body Text 3"/>
     <w:lsdException w:uiPriority="99" w:name="Body Text Indent 2"/>
     <w:lsdException w:uiPriority="99" w:name="Body Text Indent 3"/>
     <w:lsdException w:uiPriority="99" w:name="Block Text"/>
@@ -15003,10 +16712,10 @@
     <w:lsdException w:uiPriority="99" w:name="Table Theme"/>
     <w:lsdException w:qFormat="1" w:unhideWhenUsed="0" w:uiPriority="1" w:semiHidden="0" w:name="No Spacing"/>
     <w:lsdException w:qFormat="1" w:unhideWhenUsed="0" w:uiPriority="60" w:semiHidden="0" w:name="Light Shading"/>
-    <w:lsdException w:unhideWhenUsed="0" w:uiPriority="61" w:semiHidden="0" w:name="Light List"/>
-    <w:lsdException w:unhideWhenUsed="0" w:uiPriority="62" w:semiHidden="0" w:name="Light Grid"/>
+    <w:lsdException w:qFormat="1" w:unhideWhenUsed="0" w:uiPriority="61" w:semiHidden="0" w:name="Light List"/>
+    <w:lsdException w:qFormat="1" w:unhideWhenUsed="0" w:uiPriority="62" w:semiHidden="0" w:name="Light Grid"/>
     <w:lsdException w:qFormat="1" w:unhideWhenUsed="0" w:uiPriority="63" w:semiHidden="0" w:name="Medium Shading 1"/>
-    <w:lsdException w:unhideWhenUsed="0" w:uiPriority="64" w:semiHidden="0" w:name="Medium Shading 2"/>
+    <w:lsdException w:qFormat="1" w:unhideWhenUsed="0" w:uiPriority="64" w:semiHidden="0" w:name="Medium Shading 2"/>
     <w:lsdException w:qFormat="1" w:unhideWhenUsed="0" w:uiPriority="65" w:semiHidden="0" w:name="Medium List 1"/>
     <w:lsdException w:qFormat="1" w:unhideWhenUsed="0" w:uiPriority="66" w:semiHidden="0" w:name="Medium List 2"/>
     <w:lsdException w:qFormat="1" w:unhideWhenUsed="0" w:uiPriority="67" w:semiHidden="0" w:name="Medium Grid 1"/>
@@ -15017,16 +16726,16 @@
     <w:lsdException w:unhideWhenUsed="0" w:uiPriority="72" w:semiHidden="0" w:name="Colorful List"/>
     <w:lsdException w:qFormat="1" w:unhideWhenUsed="0" w:uiPriority="73" w:semiHidden="0" w:name="Colorful Grid"/>
     <w:lsdException w:qFormat="1" w:unhideWhenUsed="0" w:uiPriority="60" w:semiHidden="0" w:name="Light Shading Accent 1"/>
-    <w:lsdException w:unhideWhenUsed="0" w:uiPriority="61" w:semiHidden="0" w:name="Light List Accent 1"/>
+    <w:lsdException w:qFormat="1" w:unhideWhenUsed="0" w:uiPriority="61" w:semiHidden="0" w:name="Light List Accent 1"/>
     <w:lsdException w:qFormat="1" w:unhideWhenUsed="0" w:uiPriority="62" w:semiHidden="0" w:name="Light Grid Accent 1"/>
     <w:lsdException w:qFormat="1" w:unhideWhenUsed="0" w:uiPriority="63" w:semiHidden="0" w:name="Medium Shading 1 Accent 1"/>
-    <w:lsdException w:unhideWhenUsed="0" w:uiPriority="64" w:semiHidden="0" w:name="Medium Shading 2 Accent 1"/>
+    <w:lsdException w:qFormat="1" w:unhideWhenUsed="0" w:uiPriority="64" w:semiHidden="0" w:name="Medium Shading 2 Accent 1"/>
     <w:lsdException w:qFormat="1" w:unhideWhenUsed="0" w:uiPriority="65" w:semiHidden="0" w:name="Medium List 1 Accent 1"/>
     <w:lsdException w:qFormat="1" w:unhideWhenUsed="0" w:uiPriority="34" w:semiHidden="0" w:name="List Paragraph"/>
     <w:lsdException w:qFormat="1" w:unhideWhenUsed="0" w:uiPriority="29" w:semiHidden="0" w:name="Quote"/>
     <w:lsdException w:qFormat="1" w:unhideWhenUsed="0" w:uiPriority="30" w:semiHidden="0" w:name="Intense Quote"/>
     <w:lsdException w:qFormat="1" w:unhideWhenUsed="0" w:uiPriority="66" w:semiHidden="0" w:name="Medium List 2 Accent 1"/>
-    <w:lsdException w:unhideWhenUsed="0" w:uiPriority="67" w:semiHidden="0" w:name="Medium Grid 1 Accent 1"/>
+    <w:lsdException w:qFormat="1" w:unhideWhenUsed="0" w:uiPriority="67" w:semiHidden="0" w:name="Medium Grid 1 Accent 1"/>
     <w:lsdException w:qFormat="1" w:unhideWhenUsed="0" w:uiPriority="68" w:semiHidden="0" w:name="Medium Grid 2 Accent 1"/>
     <w:lsdException w:unhideWhenUsed="0" w:uiPriority="69" w:semiHidden="0" w:name="Medium Grid 3 Accent 1"/>
     <w:lsdException w:qFormat="1" w:unhideWhenUsed="0" w:uiPriority="70" w:semiHidden="0" w:name="Dark List Accent 1"/>
@@ -15035,39 +16744,39 @@
     <w:lsdException w:qFormat="1" w:unhideWhenUsed="0" w:uiPriority="73" w:semiHidden="0" w:name="Colorful Grid Accent 1"/>
     <w:lsdException w:qFormat="1" w:unhideWhenUsed="0" w:uiPriority="60" w:semiHidden="0" w:name="Light Shading Accent 2"/>
     <w:lsdException w:qFormat="1" w:unhideWhenUsed="0" w:uiPriority="61" w:semiHidden="0" w:name="Light List Accent 2"/>
-    <w:lsdException w:unhideWhenUsed="0" w:uiPriority="62" w:semiHidden="0" w:name="Light Grid Accent 2"/>
-    <w:lsdException w:unhideWhenUsed="0" w:uiPriority="63" w:semiHidden="0" w:name="Medium Shading 1 Accent 2"/>
-    <w:lsdException w:unhideWhenUsed="0" w:uiPriority="64" w:semiHidden="0" w:name="Medium Shading 2 Accent 2"/>
+    <w:lsdException w:qFormat="1" w:unhideWhenUsed="0" w:uiPriority="62" w:semiHidden="0" w:name="Light Grid Accent 2"/>
+    <w:lsdException w:qFormat="1" w:unhideWhenUsed="0" w:uiPriority="63" w:semiHidden="0" w:name="Medium Shading 1 Accent 2"/>
+    <w:lsdException w:qFormat="1" w:unhideWhenUsed="0" w:uiPriority="64" w:semiHidden="0" w:name="Medium Shading 2 Accent 2"/>
     <w:lsdException w:qFormat="1" w:unhideWhenUsed="0" w:uiPriority="65" w:semiHidden="0" w:name="Medium List 1 Accent 2"/>
-    <w:lsdException w:unhideWhenUsed="0" w:uiPriority="66" w:semiHidden="0" w:name="Medium List 2 Accent 2"/>
-    <w:lsdException w:unhideWhenUsed="0" w:uiPriority="67" w:semiHidden="0" w:name="Medium Grid 1 Accent 2"/>
+    <w:lsdException w:qFormat="1" w:unhideWhenUsed="0" w:uiPriority="66" w:semiHidden="0" w:name="Medium List 2 Accent 2"/>
+    <w:lsdException w:qFormat="1" w:unhideWhenUsed="0" w:uiPriority="67" w:semiHidden="0" w:name="Medium Grid 1 Accent 2"/>
     <w:lsdException w:qFormat="1" w:unhideWhenUsed="0" w:uiPriority="68" w:semiHidden="0" w:name="Medium Grid 2 Accent 2"/>
     <w:lsdException w:qFormat="1" w:unhideWhenUsed="0" w:uiPriority="69" w:semiHidden="0" w:name="Medium Grid 3 Accent 2"/>
     <w:lsdException w:qFormat="1" w:unhideWhenUsed="0" w:uiPriority="70" w:semiHidden="0" w:name="Dark List Accent 2"/>
     <w:lsdException w:qFormat="1" w:unhideWhenUsed="0" w:uiPriority="71" w:semiHidden="0" w:name="Colorful Shading Accent 2"/>
     <w:lsdException w:qFormat="1" w:unhideWhenUsed="0" w:uiPriority="72" w:semiHidden="0" w:name="Colorful List Accent 2"/>
-    <w:lsdException w:unhideWhenUsed="0" w:uiPriority="73" w:semiHidden="0" w:name="Colorful Grid Accent 2"/>
-    <w:lsdException w:unhideWhenUsed="0" w:uiPriority="60" w:semiHidden="0" w:name="Light Shading Accent 3"/>
+    <w:lsdException w:qFormat="1" w:unhideWhenUsed="0" w:uiPriority="73" w:semiHidden="0" w:name="Colorful Grid Accent 2"/>
+    <w:lsdException w:qFormat="1" w:unhideWhenUsed="0" w:uiPriority="60" w:semiHidden="0" w:name="Light Shading Accent 3"/>
     <w:lsdException w:qFormat="1" w:unhideWhenUsed="0" w:uiPriority="61" w:semiHidden="0" w:name="Light List Accent 3"/>
-    <w:lsdException w:unhideWhenUsed="0" w:uiPriority="62" w:semiHidden="0" w:name="Light Grid Accent 3"/>
+    <w:lsdException w:qFormat="1" w:unhideWhenUsed="0" w:uiPriority="62" w:semiHidden="0" w:name="Light Grid Accent 3"/>
     <w:lsdException w:qFormat="1" w:unhideWhenUsed="0" w:uiPriority="63" w:semiHidden="0" w:name="Medium Shading 1 Accent 3"/>
-    <w:lsdException w:unhideWhenUsed="0" w:uiPriority="64" w:semiHidden="0" w:name="Medium Shading 2 Accent 3"/>
+    <w:lsdException w:qFormat="1" w:unhideWhenUsed="0" w:uiPriority="64" w:semiHidden="0" w:name="Medium Shading 2 Accent 3"/>
     <w:lsdException w:qFormat="1" w:unhideWhenUsed="0" w:uiPriority="65" w:semiHidden="0" w:name="Medium List 1 Accent 3"/>
-    <w:lsdException w:unhideWhenUsed="0" w:uiPriority="66" w:semiHidden="0" w:name="Medium List 2 Accent 3"/>
+    <w:lsdException w:qFormat="1" w:unhideWhenUsed="0" w:uiPriority="66" w:semiHidden="0" w:name="Medium List 2 Accent 3"/>
     <w:lsdException w:qFormat="1" w:unhideWhenUsed="0" w:uiPriority="67" w:semiHidden="0" w:name="Medium Grid 1 Accent 3"/>
     <w:lsdException w:unhideWhenUsed="0" w:uiPriority="68" w:semiHidden="0" w:name="Medium Grid 2 Accent 3"/>
     <w:lsdException w:qFormat="1" w:unhideWhenUsed="0" w:uiPriority="69" w:semiHidden="0" w:name="Medium Grid 3 Accent 3"/>
-    <w:lsdException w:unhideWhenUsed="0" w:uiPriority="70" w:semiHidden="0" w:name="Dark List Accent 3"/>
+    <w:lsdException w:qFormat="1" w:unhideWhenUsed="0" w:uiPriority="70" w:semiHidden="0" w:name="Dark List Accent 3"/>
     <w:lsdException w:qFormat="1" w:unhideWhenUsed="0" w:uiPriority="71" w:semiHidden="0" w:name="Colorful Shading Accent 3"/>
     <w:lsdException w:qFormat="1" w:unhideWhenUsed="0" w:uiPriority="72" w:semiHidden="0" w:name="Colorful List Accent 3"/>
     <w:lsdException w:qFormat="1" w:unhideWhenUsed="0" w:uiPriority="73" w:semiHidden="0" w:name="Colorful Grid Accent 3"/>
-    <w:lsdException w:unhideWhenUsed="0" w:uiPriority="60" w:semiHidden="0" w:name="Light Shading Accent 4"/>
-    <w:lsdException w:unhideWhenUsed="0" w:uiPriority="61" w:semiHidden="0" w:name="Light List Accent 4"/>
+    <w:lsdException w:qFormat="1" w:unhideWhenUsed="0" w:uiPriority="60" w:semiHidden="0" w:name="Light Shading Accent 4"/>
+    <w:lsdException w:qFormat="1" w:unhideWhenUsed="0" w:uiPriority="61" w:semiHidden="0" w:name="Light List Accent 4"/>
     <w:lsdException w:qFormat="1" w:unhideWhenUsed="0" w:uiPriority="62" w:semiHidden="0" w:name="Light Grid Accent 4"/>
     <w:lsdException w:qFormat="1" w:unhideWhenUsed="0" w:uiPriority="63" w:semiHidden="0" w:name="Medium Shading 1 Accent 4"/>
-    <w:lsdException w:unhideWhenUsed="0" w:uiPriority="64" w:semiHidden="0" w:name="Medium Shading 2 Accent 4"/>
+    <w:lsdException w:qFormat="1" w:unhideWhenUsed="0" w:uiPriority="64" w:semiHidden="0" w:name="Medium Shading 2 Accent 4"/>
     <w:lsdException w:qFormat="1" w:unhideWhenUsed="0" w:uiPriority="65" w:semiHidden="0" w:name="Medium List 1 Accent 4"/>
-    <w:lsdException w:unhideWhenUsed="0" w:uiPriority="66" w:semiHidden="0" w:name="Medium List 2 Accent 4"/>
+    <w:lsdException w:qFormat="1" w:unhideWhenUsed="0" w:uiPriority="66" w:semiHidden="0" w:name="Medium List 2 Accent 4"/>
     <w:lsdException w:qFormat="1" w:unhideWhenUsed="0" w:uiPriority="67" w:semiHidden="0" w:name="Medium Grid 1 Accent 4"/>
     <w:lsdException w:qFormat="1" w:unhideWhenUsed="0" w:uiPriority="68" w:semiHidden="0" w:name="Medium Grid 2 Accent 4"/>
     <w:lsdException w:unhideWhenUsed="0" w:uiPriority="69" w:semiHidden="0" w:name="Medium Grid 3 Accent 4"/>
@@ -15075,32 +16784,32 @@
     <w:lsdException w:qFormat="1" w:unhideWhenUsed="0" w:uiPriority="71" w:semiHidden="0" w:name="Colorful Shading Accent 4"/>
     <w:lsdException w:qFormat="1" w:unhideWhenUsed="0" w:uiPriority="72" w:semiHidden="0" w:name="Colorful List Accent 4"/>
     <w:lsdException w:qFormat="1" w:unhideWhenUsed="0" w:uiPriority="73" w:semiHidden="0" w:name="Colorful Grid Accent 4"/>
-    <w:lsdException w:unhideWhenUsed="0" w:uiPriority="60" w:semiHidden="0" w:name="Light Shading Accent 5"/>
+    <w:lsdException w:qFormat="1" w:unhideWhenUsed="0" w:uiPriority="60" w:semiHidden="0" w:name="Light Shading Accent 5"/>
     <w:lsdException w:qFormat="1" w:unhideWhenUsed="0" w:uiPriority="61" w:semiHidden="0" w:name="Light List Accent 5"/>
     <w:lsdException w:qFormat="1" w:unhideWhenUsed="0" w:uiPriority="62" w:semiHidden="0" w:name="Light Grid Accent 5"/>
     <w:lsdException w:qFormat="1" w:unhideWhenUsed="0" w:uiPriority="63" w:semiHidden="0" w:name="Medium Shading 1 Accent 5"/>
-    <w:lsdException w:unhideWhenUsed="0" w:uiPriority="64" w:semiHidden="0" w:name="Medium Shading 2 Accent 5"/>
+    <w:lsdException w:qFormat="1" w:unhideWhenUsed="0" w:uiPriority="64" w:semiHidden="0" w:name="Medium Shading 2 Accent 5"/>
     <w:lsdException w:qFormat="1" w:unhideWhenUsed="0" w:uiPriority="65" w:semiHidden="0" w:name="Medium List 1 Accent 5"/>
-    <w:lsdException w:unhideWhenUsed="0" w:uiPriority="66" w:semiHidden="0" w:name="Medium List 2 Accent 5"/>
-    <w:lsdException w:unhideWhenUsed="0" w:uiPriority="67" w:semiHidden="0" w:name="Medium Grid 1 Accent 5"/>
+    <w:lsdException w:qFormat="1" w:unhideWhenUsed="0" w:uiPriority="66" w:semiHidden="0" w:name="Medium List 2 Accent 5"/>
+    <w:lsdException w:qFormat="1" w:unhideWhenUsed="0" w:uiPriority="67" w:semiHidden="0" w:name="Medium Grid 1 Accent 5"/>
     <w:lsdException w:qFormat="1" w:unhideWhenUsed="0" w:uiPriority="68" w:semiHidden="0" w:name="Medium Grid 2 Accent 5"/>
     <w:lsdException w:unhideWhenUsed="0" w:uiPriority="69" w:semiHidden="0" w:name="Medium Grid 3 Accent 5"/>
     <w:lsdException w:qFormat="1" w:unhideWhenUsed="0" w:uiPriority="70" w:semiHidden="0" w:name="Dark List Accent 5"/>
     <w:lsdException w:qFormat="1" w:unhideWhenUsed="0" w:uiPriority="71" w:semiHidden="0" w:name="Colorful Shading Accent 5"/>
     <w:lsdException w:unhideWhenUsed="0" w:uiPriority="72" w:semiHidden="0" w:name="Colorful List Accent 5"/>
-    <w:lsdException w:unhideWhenUsed="0" w:uiPriority="73" w:semiHidden="0" w:name="Colorful Grid Accent 5"/>
+    <w:lsdException w:qFormat="1" w:unhideWhenUsed="0" w:uiPriority="73" w:semiHidden="0" w:name="Colorful Grid Accent 5"/>
     <w:lsdException w:qFormat="1" w:unhideWhenUsed="0" w:uiPriority="60" w:semiHidden="0" w:name="Light Shading Accent 6"/>
     <w:lsdException w:qFormat="1" w:unhideWhenUsed="0" w:uiPriority="61" w:semiHidden="0" w:name="Light List Accent 6"/>
-    <w:lsdException w:unhideWhenUsed="0" w:uiPriority="62" w:semiHidden="0" w:name="Light Grid Accent 6"/>
+    <w:lsdException w:qFormat="1" w:unhideWhenUsed="0" w:uiPriority="62" w:semiHidden="0" w:name="Light Grid Accent 6"/>
     <w:lsdException w:qFormat="1" w:unhideWhenUsed="0" w:uiPriority="63" w:semiHidden="0" w:name="Medium Shading 1 Accent 6"/>
-    <w:lsdException w:unhideWhenUsed="0" w:uiPriority="64" w:semiHidden="0" w:name="Medium Shading 2 Accent 6"/>
+    <w:lsdException w:qFormat="1" w:unhideWhenUsed="0" w:uiPriority="64" w:semiHidden="0" w:name="Medium Shading 2 Accent 6"/>
     <w:lsdException w:qFormat="1" w:unhideWhenUsed="0" w:uiPriority="65" w:semiHidden="0" w:name="Medium List 1 Accent 6"/>
     <w:lsdException w:qFormat="1" w:unhideWhenUsed="0" w:uiPriority="66" w:semiHidden="0" w:name="Medium List 2 Accent 6"/>
     <w:lsdException w:qFormat="1" w:unhideWhenUsed="0" w:uiPriority="67" w:semiHidden="0" w:name="Medium Grid 1 Accent 6"/>
     <w:lsdException w:qFormat="1" w:unhideWhenUsed="0" w:uiPriority="68" w:semiHidden="0" w:name="Medium Grid 2 Accent 6"/>
     <w:lsdException w:unhideWhenUsed="0" w:uiPriority="69" w:semiHidden="0" w:name="Medium Grid 3 Accent 6"/>
-    <w:lsdException w:unhideWhenUsed="0" w:uiPriority="70" w:semiHidden="0" w:name="Dark List Accent 6"/>
-    <w:lsdException w:unhideWhenUsed="0" w:uiPriority="71" w:semiHidden="0" w:name="Colorful Shading Accent 6"/>
+    <w:lsdException w:qFormat="1" w:unhideWhenUsed="0" w:uiPriority="70" w:semiHidden="0" w:name="Dark List Accent 6"/>
+    <w:lsdException w:qFormat="1" w:unhideWhenUsed="0" w:uiPriority="71" w:semiHidden="0" w:name="Colorful Shading Accent 6"/>
     <w:lsdException w:qFormat="1" w:unhideWhenUsed="0" w:uiPriority="72" w:semiHidden="0" w:name="Colorful List Accent 6"/>
     <w:lsdException w:unhideWhenUsed="0" w:uiPriority="73" w:semiHidden="0" w:name="Colorful Grid Accent 6"/>
   </w:latentStyles>
@@ -15346,6 +17055,7 @@
     <w:name w:val="Default Paragraph Font"/>
     <w:semiHidden/>
     <w:unhideWhenUsed/>
+    <w:qFormat/>
     <w:uiPriority w:val="1"/>
   </w:style>
   <w:style w:type="table" w:default="1" w:styleId="32">
@@ -15470,6 +17180,7 @@
     <w:basedOn w:val="1"/>
     <w:link w:val="146"/>
     <w:unhideWhenUsed/>
+    <w:qFormat/>
     <w:uiPriority w:val="99"/>
     <w:pPr>
       <w:spacing w:after="120"/>
@@ -16002,6 +17713,7 @@
   <w:style w:type="table" w:styleId="37">
     <w:name w:val="Light Shading Accent 3"/>
     <w:basedOn w:val="32"/>
+    <w:qFormat/>
     <w:uiPriority w:val="60"/>
     <w:pPr>
       <w:spacing w:after="0" w:line="240" w:lineRule="auto"/>
@@ -16101,6 +17813,7 @@
   <w:style w:type="table" w:styleId="38">
     <w:name w:val="Light Shading Accent 4"/>
     <w:basedOn w:val="32"/>
+    <w:qFormat/>
     <w:uiPriority w:val="60"/>
     <w:pPr>
       <w:spacing w:after="0" w:line="240" w:lineRule="auto"/>
@@ -16200,6 +17913,7 @@
   <w:style w:type="table" w:styleId="39">
     <w:name w:val="Light Shading Accent 5"/>
     <w:basedOn w:val="32"/>
+    <w:qFormat/>
     <w:uiPriority w:val="60"/>
     <w:pPr>
       <w:spacing w:after="0" w:line="240" w:lineRule="auto"/>
@@ -16399,6 +18113,7 @@
   <w:style w:type="table" w:styleId="41">
     <w:name w:val="Light List"/>
     <w:basedOn w:val="32"/>
+    <w:qFormat/>
     <w:uiPriority w:val="61"/>
     <w:pPr>
       <w:spacing w:after="0" w:line="240" w:lineRule="auto"/>
@@ -16492,6 +18207,7 @@
   <w:style w:type="table" w:styleId="42">
     <w:name w:val="Light List Accent 1"/>
     <w:basedOn w:val="32"/>
+    <w:qFormat/>
     <w:uiPriority w:val="61"/>
     <w:pPr>
       <w:spacing w:after="0" w:line="240" w:lineRule="auto"/>
@@ -16773,6 +18489,7 @@
   <w:style w:type="table" w:styleId="45">
     <w:name w:val="Light List Accent 4"/>
     <w:basedOn w:val="32"/>
+    <w:qFormat/>
     <w:uiPriority w:val="61"/>
     <w:pPr>
       <w:spacing w:after="0" w:line="240" w:lineRule="auto"/>
@@ -17054,6 +18771,7 @@
   <w:style w:type="table" w:styleId="48">
     <w:name w:val="Light Grid"/>
     <w:basedOn w:val="32"/>
+    <w:qFormat/>
     <w:uiPriority w:val="62"/>
     <w:pPr>
       <w:spacing w:after="0" w:line="240" w:lineRule="auto"/>
@@ -17307,6 +19025,7 @@
   <w:style w:type="table" w:styleId="50">
     <w:name w:val="Light Grid Accent 2"/>
     <w:basedOn w:val="32"/>
+    <w:qFormat/>
     <w:uiPriority w:val="62"/>
     <w:pPr>
       <w:spacing w:after="0" w:line="240" w:lineRule="auto"/>
@@ -17433,6 +19152,7 @@
   <w:style w:type="table" w:styleId="51">
     <w:name w:val="Light Grid Accent 3"/>
     <w:basedOn w:val="32"/>
+    <w:qFormat/>
     <w:uiPriority w:val="62"/>
     <w:pPr>
       <w:spacing w:after="0" w:line="240" w:lineRule="auto"/>
@@ -17813,6 +19533,7 @@
   <w:style w:type="table" w:styleId="54">
     <w:name w:val="Light Grid Accent 6"/>
     <w:basedOn w:val="32"/>
+    <w:qFormat/>
     <w:uiPriority w:val="62"/>
     <w:pPr>
       <w:spacing w:after="0" w:line="240" w:lineRule="auto"/>
@@ -18155,6 +19876,7 @@
   <w:style w:type="table" w:styleId="57">
     <w:name w:val="Medium Shading 1 Accent 2"/>
     <w:basedOn w:val="32"/>
+    <w:qFormat/>
     <w:uiPriority w:val="63"/>
     <w:pPr>
       <w:spacing w:after="0" w:line="240" w:lineRule="auto"/>
@@ -18694,6 +20416,7 @@
   <w:style w:type="table" w:styleId="62">
     <w:name w:val="Medium Shading 2"/>
     <w:basedOn w:val="32"/>
+    <w:qFormat/>
     <w:uiPriority w:val="64"/>
     <w:pPr>
       <w:spacing w:after="0" w:line="240" w:lineRule="auto"/>
@@ -18859,6 +20582,7 @@
   <w:style w:type="table" w:styleId="63">
     <w:name w:val="Medium Shading 2 Accent 1"/>
     <w:basedOn w:val="32"/>
+    <w:qFormat/>
     <w:uiPriority w:val="64"/>
     <w:pPr>
       <w:spacing w:after="0" w:line="240" w:lineRule="auto"/>
@@ -19024,6 +20748,7 @@
   <w:style w:type="table" w:styleId="64">
     <w:name w:val="Medium Shading 2 Accent 2"/>
     <w:basedOn w:val="32"/>
+    <w:qFormat/>
     <w:uiPriority w:val="64"/>
     <w:pPr>
       <w:spacing w:after="0" w:line="240" w:lineRule="auto"/>
@@ -19189,6 +20914,7 @@
   <w:style w:type="table" w:styleId="65">
     <w:name w:val="Medium Shading 2 Accent 3"/>
     <w:basedOn w:val="32"/>
+    <w:qFormat/>
     <w:uiPriority w:val="64"/>
     <w:pPr>
       <w:spacing w:after="0" w:line="240" w:lineRule="auto"/>
@@ -19354,6 +21080,7 @@
   <w:style w:type="table" w:styleId="66">
     <w:name w:val="Medium Shading 2 Accent 4"/>
     <w:basedOn w:val="32"/>
+    <w:qFormat/>
     <w:uiPriority w:val="64"/>
     <w:pPr>
       <w:spacing w:after="0" w:line="240" w:lineRule="auto"/>
@@ -19519,6 +21246,7 @@
   <w:style w:type="table" w:styleId="67">
     <w:name w:val="Medium Shading 2 Accent 5"/>
     <w:basedOn w:val="32"/>
+    <w:qFormat/>
     <w:uiPriority w:val="64"/>
     <w:pPr>
       <w:spacing w:after="0" w:line="240" w:lineRule="auto"/>
@@ -19684,6 +21412,7 @@
   <w:style w:type="table" w:styleId="68">
     <w:name w:val="Medium Shading 2 Accent 6"/>
     <w:basedOn w:val="32"/>
+    <w:qFormat/>
     <w:uiPriority w:val="64"/>
     <w:pPr>
       <w:spacing w:after="0" w:line="240" w:lineRule="auto"/>
@@ -20746,6 +22475,7 @@
   <w:style w:type="table" w:styleId="78">
     <w:name w:val="Medium List 2 Accent 2"/>
     <w:basedOn w:val="32"/>
+    <w:qFormat/>
     <w:uiPriority w:val="66"/>
     <w:pPr>
       <w:spacing w:after="0" w:line="240" w:lineRule="auto"/>
@@ -20875,6 +22605,7 @@
   <w:style w:type="table" w:styleId="79">
     <w:name w:val="Medium List 2 Accent 3"/>
     <w:basedOn w:val="32"/>
+    <w:qFormat/>
     <w:uiPriority w:val="66"/>
     <w:pPr>
       <w:spacing w:after="0" w:line="240" w:lineRule="auto"/>
@@ -21004,6 +22735,7 @@
   <w:style w:type="table" w:styleId="80">
     <w:name w:val="Medium List 2 Accent 4"/>
     <w:basedOn w:val="32"/>
+    <w:qFormat/>
     <w:uiPriority w:val="66"/>
     <w:pPr>
       <w:spacing w:after="0" w:line="240" w:lineRule="auto"/>
@@ -21133,6 +22865,7 @@
   <w:style w:type="table" w:styleId="81">
     <w:name w:val="Medium List 2 Accent 5"/>
     <w:basedOn w:val="32"/>
+    <w:qFormat/>
     <w:uiPriority w:val="66"/>
     <w:pPr>
       <w:spacing w:after="0" w:line="240" w:lineRule="auto"/>
@@ -21462,6 +23195,7 @@
   <w:style w:type="table" w:styleId="84">
     <w:name w:val="Medium Grid 1 Accent 1"/>
     <w:basedOn w:val="32"/>
+    <w:qFormat/>
     <w:uiPriority w:val="67"/>
     <w:pPr>
       <w:spacing w:after="0" w:line="240" w:lineRule="auto"/>
@@ -21531,6 +23265,7 @@
   <w:style w:type="table" w:styleId="85">
     <w:name w:val="Medium Grid 1 Accent 2"/>
     <w:basedOn w:val="32"/>
+    <w:qFormat/>
     <w:uiPriority w:val="67"/>
     <w:pPr>
       <w:spacing w:after="0" w:line="240" w:lineRule="auto"/>
@@ -21740,6 +23475,7 @@
   <w:style w:type="table" w:styleId="88">
     <w:name w:val="Medium Grid 1 Accent 5"/>
     <w:basedOn w:val="32"/>
+    <w:qFormat/>
     <w:uiPriority w:val="67"/>
     <w:pPr>
       <w:spacing w:after="0" w:line="240" w:lineRule="auto"/>
@@ -24356,6 +26092,7 @@
   <w:style w:type="table" w:styleId="107">
     <w:name w:val="Dark List Accent 3"/>
     <w:basedOn w:val="32"/>
+    <w:qFormat/>
     <w:uiPriority w:val="70"/>
     <w:pPr>
       <w:spacing w:after="0" w:line="240" w:lineRule="auto"/>
@@ -24703,6 +26440,7 @@
   <w:style w:type="table" w:styleId="110">
     <w:name w:val="Dark List Accent 6"/>
     <w:basedOn w:val="32"/>
+    <w:qFormat/>
     <w:uiPriority w:val="70"/>
     <w:pPr>
       <w:spacing w:after="0" w:line="240" w:lineRule="auto"/>
@@ -25691,6 +27429,7 @@
   <w:style w:type="table" w:styleId="117">
     <w:name w:val="Colorful Shading Accent 6"/>
     <w:basedOn w:val="32"/>
+    <w:qFormat/>
     <w:uiPriority w:val="71"/>
     <w:pPr>
       <w:spacing w:after="0" w:line="240" w:lineRule="auto"/>
@@ -26682,6 +28421,7 @@
   <w:style w:type="table" w:styleId="127">
     <w:name w:val="Colorful Grid Accent 2"/>
     <w:basedOn w:val="32"/>
+    <w:qFormat/>
     <w:uiPriority w:val="73"/>
     <w:pPr>
       <w:spacing w:after="0" w:line="240" w:lineRule="auto"/>
@@ -26972,6 +28712,7 @@
   <w:style w:type="table" w:styleId="130">
     <w:name w:val="Colorful Grid Accent 5"/>
     <w:basedOn w:val="32"/>
+    <w:qFormat/>
     <w:uiPriority w:val="73"/>
     <w:pPr>
       <w:spacing w:after="0" w:line="240" w:lineRule="auto"/>
@@ -27191,6 +28932,7 @@
     <w:name w:val="Footer Char"/>
     <w:basedOn w:val="132"/>
     <w:link w:val="24"/>
+    <w:qFormat/>
     <w:uiPriority w:val="99"/>
   </w:style>
   <w:style w:type="paragraph" w:styleId="137">

</xml_diff>